<commit_message>
docs: SRS v1.3 separates the Checklist Library and the Gate Library
4.23 becomes the Checklist Library: checklists are independent entries related to
zero, one or several gates, and stand-alone checklists attach to a phase, task or
project (CHK-01 to 05 reworded, CHK-06 and 07 added). 4.35 becomes the Gate Library:
gate CRUD with associated checklists, attachable to any phase (GTE-01 to 07).
Definitions, data model, interfaces, appendices and TOC follow.

Co-Authored-By: Claude Opus 5.5 <noreply@anthropic.com>
Claude-Session: https://claude.ai/code/session_017KtXLt3mYH4XoBGFVP5Vh6
</commit_message>
<xml_diff>
--- a/cortexplm/docs/guides/Dynamic_Apps_Standard_SRS_v1.3.docx
+++ b/cortexplm/docs/guides/Dynamic_Apps_Standard_SRS_v1.3.docx
@@ -1806,7 +1806,7 @@
           <w:szCs w:val="21"/>
           <w:lang w:val="en-US"/>
         </w:rPr>
-        <w:t xml:space="preserve">4.23 Stage Checklist Library</w:t>
+        <w:t xml:space="preserve">4.23 Checklist Library</w:t>
       </w:r>
       <w:r>
         <w:rPr>
@@ -1878,7 +1878,7 @@
           <w:lang w:val="en-US"/>
         </w:rPr>
         <w:tab/>
-        <w:t xml:space="preserve">28</w:t>
+        <w:t xml:space="preserve">29</w:t>
       </w:r>
     </w:p>
     <w:p>
@@ -2002,7 +2002,7 @@
           <w:lang w:val="en-US"/>
         </w:rPr>
         <w:tab/>
-        <w:t xml:space="preserve">30</w:t>
+        <w:t xml:space="preserve">31</w:t>
       </w:r>
     </w:p>
     <w:p>
@@ -2064,7 +2064,7 @@
           <w:lang w:val="en-US"/>
         </w:rPr>
         <w:tab/>
-        <w:t xml:space="preserve">31</w:t>
+        <w:t xml:space="preserve">32</w:t>
       </w:r>
     </w:p>
     <w:p>
@@ -2157,7 +2157,7 @@
           <w:lang w:val="en-US"/>
         </w:rPr>
         <w:tab/>
-        <w:t xml:space="preserve">32</w:t>
+        <w:t xml:space="preserve">33</w:t>
       </w:r>
     </w:p>
     <w:p>
@@ -2178,7 +2178,7 @@
           <w:szCs w:val="21"/>
           <w:lang w:val="en-US"/>
         </w:rPr>
-        <w:t xml:space="preserve">4.35 Gate &amp; Checklist Library</w:t>
+        <w:t xml:space="preserve">4.35 Gate Library</w:t>
       </w:r>
       <w:r>
         <w:rPr>
@@ -2223,7 +2223,7 @@
           <w:lang w:val="en-US"/>
         </w:rPr>
         <w:tab/>
-        <w:t>34</w:t>
+        <w:t>35</w:t>
       </w:r>
     </w:p>
     <w:p>
@@ -2254,7 +2254,7 @@
           <w:lang w:val="en-US"/>
         </w:rPr>
         <w:tab/>
-        <w:t>34</w:t>
+        <w:t>35</w:t>
       </w:r>
     </w:p>
     <w:p>
@@ -2285,7 +2285,7 @@
           <w:lang w:val="en-US"/>
         </w:rPr>
         <w:tab/>
-        <w:t>34</w:t>
+        <w:t>35</w:t>
       </w:r>
     </w:p>
     <w:p>
@@ -2316,7 +2316,7 @@
           <w:lang w:val="en-US"/>
         </w:rPr>
         <w:tab/>
-        <w:t>35</w:t>
+        <w:t>36</w:t>
       </w:r>
     </w:p>
     <w:p>
@@ -2347,7 +2347,7 @@
           <w:lang w:val="en-US"/>
         </w:rPr>
         <w:tab/>
-        <w:t>35</w:t>
+        <w:t>36</w:t>
       </w:r>
     </w:p>
     <w:p>
@@ -2378,7 +2378,7 @@
           <w:lang w:val="en-US"/>
         </w:rPr>
         <w:tab/>
-        <w:t>36</w:t>
+        <w:t>37</w:t>
       </w:r>
     </w:p>
     <w:p>
@@ -2409,7 +2409,7 @@
           <w:lang w:val="en-US"/>
         </w:rPr>
         <w:tab/>
-        <w:t>36</w:t>
+        <w:t>37</w:t>
       </w:r>
     </w:p>
     <w:p>
@@ -2449,7 +2449,7 @@
           <w:lang w:val="en-US"/>
         </w:rPr>
         <w:tab/>
-        <w:t>36</w:t>
+        <w:t>37</w:t>
       </w:r>
     </w:p>
     <w:p>
@@ -2480,7 +2480,7 @@
           <w:lang w:val="en-US"/>
         </w:rPr>
         <w:tab/>
-        <w:t>37</w:t>
+        <w:t>38</w:t>
       </w:r>
     </w:p>
     <w:p>
@@ -2511,7 +2511,7 @@
           <w:lang w:val="en-US"/>
         </w:rPr>
         <w:tab/>
-        <w:t>37</w:t>
+        <w:t>38</w:t>
       </w:r>
     </w:p>
     <w:p>
@@ -2542,7 +2542,7 @@
           <w:lang w:val="en-US"/>
         </w:rPr>
         <w:tab/>
-        <w:t>37</w:t>
+        <w:t>38</w:t>
       </w:r>
     </w:p>
     <w:p>
@@ -2573,7 +2573,7 @@
           <w:lang w:val="en-US"/>
         </w:rPr>
         <w:tab/>
-        <w:t>38</w:t>
+        <w:t>39</w:t>
       </w:r>
     </w:p>
     <w:p>
@@ -2607,7 +2607,7 @@
           <w:lang w:val="en-US"/>
         </w:rPr>
         <w:tab/>
-        <w:t>39</w:t>
+        <w:t>40</w:t>
       </w:r>
     </w:p>
     <w:p>
@@ -2641,7 +2641,7 @@
           <w:lang w:val="en-US"/>
         </w:rPr>
         <w:tab/>
-        <w:t>41</w:t>
+        <w:t>42</w:t>
       </w:r>
     </w:p>
     <w:p>
@@ -2672,7 +2672,7 @@
           <w:lang w:val="en-US"/>
         </w:rPr>
         <w:tab/>
-        <w:t>41</w:t>
+        <w:t>42</w:t>
       </w:r>
     </w:p>
     <w:p>
@@ -2703,7 +2703,7 @@
           <w:lang w:val="en-US"/>
         </w:rPr>
         <w:tab/>
-        <w:t>41</w:t>
+        <w:t>42</w:t>
       </w:r>
     </w:p>
     <w:p>
@@ -2734,7 +2734,7 @@
           <w:lang w:val="en-US"/>
         </w:rPr>
         <w:tab/>
-        <w:t>42</w:t>
+        <w:t>43</w:t>
       </w:r>
     </w:p>
     <w:p>
@@ -2765,7 +2765,7 @@
           <w:lang w:val="en-US"/>
         </w:rPr>
         <w:tab/>
-        <w:t>42</w:t>
+        <w:t>43</w:t>
       </w:r>
     </w:p>
     <w:p>
@@ -2799,7 +2799,7 @@
           <w:lang w:val="en-US"/>
         </w:rPr>
         <w:tab/>
-        <w:t>43</w:t>
+        <w:t>44</w:t>
       </w:r>
     </w:p>
     <w:p>
@@ -2833,7 +2833,7 @@
           <w:lang w:val="en-US"/>
         </w:rPr>
         <w:tab/>
-        <w:t xml:space="preserve">47</w:t>
+        <w:t xml:space="preserve">48</w:t>
       </w:r>
     </w:p>
     <w:p>
@@ -2867,7 +2867,7 @@
           <w:lang w:val="en-US"/>
         </w:rPr>
         <w:tab/>
-        <w:t xml:space="preserve">49</w:t>
+        <w:t xml:space="preserve">50</w:t>
       </w:r>
     </w:p>
     <w:p>
@@ -2901,7 +2901,7 @@
           <w:lang w:val="en-US"/>
         </w:rPr>
         <w:tab/>
-        <w:t xml:space="preserve">50</w:t>
+        <w:t xml:space="preserve">51</w:t>
       </w:r>
     </w:p>
     <w:p>
@@ -2935,7 +2935,7 @@
           <w:lang w:val="en-US"/>
         </w:rPr>
         <w:tab/>
-        <w:t xml:space="preserve">52</w:t>
+        <w:t xml:space="preserve">53</w:t>
       </w:r>
     </w:p>
     <w:p>
@@ -3080,7 +3080,7 @@
         <w:rPr>
           <w:lang w:val="en-US"/>
         </w:rPr>
-        <w:t xml:space="preserve">Revision 1.3 integrates the application-agnostic requirements for the Vertical and SME layers — the vertical framework, vertical processes, data, compliance, integration and configuration, the SME mode with its tracks, complexity scoring, onboarding, packaging and pricing, and their combination — restated as Dynamic App requirements. It also adds, for any Dynamic App, a project template catalog (universal or per vertical, Full or SME mode) with full CRUD, three ways to create a project (from the catalog, manually, or with AI), and a gate and checklist library whose entries can be created and attached to any project phase. Appendix D lists the changes and Appendix E traces every source requirement family to its requirements here.</w:t>
+        <w:t xml:space="preserve">Revision 1.3 integrates the application-agnostic requirements for the Vertical and SME layers — the vertical framework, vertical processes, data, compliance, integration and configuration, the SME mode with its tracks, complexity scoring, onboarding, packaging and pricing, and their combination — restated as Dynamic App requirements. It also adds, for any Dynamic App, a project template catalog (universal or per vertical, Full or SME mode) with full CRUD, three ways to create a project (from the catalog, manually, or with AI), a Checklist Library whose checklists may or may not be related to a gate, and a Gate Library to which checklists are associated; both are managed with full CRUD and can be attached to any project phase. Appendix D lists the changes and Appendix E traces every source requirement family to its requirements here.</w:t>
       </w:r>
     </w:p>
     <w:p>
@@ -5076,7 +5076,7 @@
                 <w:sz w:val="19"/>
                 <w:szCs w:val="19"/>
               </w:rPr>
-              <w:t xml:space="preserve">Stage Checklist Template</w:t>
+              <w:t xml:space="preserve">Checklist Template</w:t>
             </w:r>
           </w:p>
         </w:tc>
@@ -5104,7 +5104,7 @@
                 <w:szCs w:val="19"/>
                 <w:lang w:val="en-US"/>
               </w:rPr>
-              <w:t xml:space="preserve">A reusable list of checklist items for one stage (gate) and one variant (track); when linked, it is copied into the stage checklist when the stage opens.</w:t>
+              <w:t xml:space="preserve">A reusable, versioned list of checklist items kept in the Checklist Library. It stands on its own and may be associated with zero, one or several gates of the Gate Library; when associated, it is copied into the gate checklist when the phase opens.</w:t>
             </w:r>
           </w:p>
         </w:tc>
@@ -5684,7 +5684,7 @@
                 <w:szCs w:val="19"/>
                 <w:lang w:val="en-US"/>
               </w:rPr>
-              <w:t xml:space="preserve">A reusable decision point — name, criteria, approvers, decision options Go / No-Go / Hold / Recycle — kept in a library and attachable to any phase.</w:t>
+              <w:t xml:space="preserve">A reusable decision point — name, criteria, approvers, decision options Go / No-Go / Hold / Recycle — kept in the Gate Library, with zero or more associated checklists, and attachable to any phase.</w:t>
             </w:r>
           </w:p>
         </w:tc>
@@ -5930,7 +5930,7 @@
         <w:rPr>
           <w:lang w:val="en-US"/>
         </w:rPr>
-        <w:t xml:space="preserve">Revision 1.3 adds Section 3.14, Sections 4.25 to 4.35, new requirements in Sections 4.13, 4.23, 5.1 to 5.6, 5.8 and 5.10, and Appendices D (change log) and E (traceability to the Verticals and SME source). Nothing was removed or renumbered.</w:t>
+        <w:t xml:space="preserve">Revision 1.3 adds Section 3.14, Sections 4.25 to 4.35, new requirements in Sections 4.13, 5.1 to 5.6, 5.8 and 5.10, and Appendices D (change log) and E (traceability to the Verticals and SME source). It renames Section 4.23 Checklist Library and rewords FR-DA-CHK-01 to 05 so that a checklist no longer has to belong to a gate; Section 4.35, the Gate Library, holds the gates and their associated checklists. Nothing was removed or renumbered.</w:t>
       </w:r>
     </w:p>
     <w:p>
@@ -8325,7 +8325,7 @@
         <w:rPr>
           <w:lang w:val="en-US"/>
         </w:rPr>
-        <w:t xml:space="preserve">Activation is additive and ordered. An Organization activates zero or more verticals; each activates its macro processes (three to five) and E2E processes (two to four). When an SME selects a vertical, the vertical processes are activated first and the SME track processes second. A project then takes a mode (Full or SME), a track recommended by its complexity score, and a template from the catalog; the template brings the phases, and the gate and checklist library supplies the gates and checklists attached to each phase.</w:t>
+        <w:t xml:space="preserve">Activation is additive and ordered. An Organization activates zero or more verticals; each activates its macro processes (three to five) and E2E processes (two to four). When an SME selects a vertical, the vertical processes are activated first and the SME track processes second. A project then takes a mode (Full or SME), a track recommended by its complexity score, and a template from the catalog; the template brings the phases, the Gate Library supplies the gates of each phase, and each gate brings the checklists associated with it from the Checklist Library; a checklist can also be attached to a phase without any gate.</w:t>
       </w:r>
     </w:p>
     <w:p>
@@ -15145,7 +15145,7 @@
         <w:rPr>
           <w:lang w:val="en-US"/>
         </w:rPr>
-        <w:t xml:space="preserve">4.23 Stage Checklist Library</w:t>
+        <w:t xml:space="preserve">4.23 Checklist Library</w:t>
       </w:r>
     </w:p>
     <w:p>
@@ -15160,7 +15160,7 @@
         <w:rPr>
           <w:lang w:val="en-US"/>
         </w:rPr>
-        <w:t xml:space="preserve">Checklists that close a stage are built from a library of templates, per stage and per variant (track), instead of being fixed in code.</w:t>
+        <w:t xml:space="preserve">The Checklist Library holds every checklist as an independent entry. A checklist may be related to a gate or not: when it is associated with a gate of the Gate Library (Section 4.35) it becomes part of that gate's exit criteria; when it is not, it can still be attached to a phase, a task or a project and used on its own.</w:t>
       </w:r>
     </w:p>
     <w:p>
@@ -15193,7 +15193,7 @@
           <w:szCs w:val="22"/>
           <w:lang w:val="en-US"/>
         </w:rPr>
-        <w:t xml:space="preserve">The system shall keep a library of checklist templates, each for one stage and one variant, with ordered items marked mandatory and evidence-required, versioned under the generic Version Management service (Section 3.8).</w:t>
+        <w:t xml:space="preserve">The system shall keep a Checklist Library with full Create, Read, Update, Delete and Duplicate on checklist templates, each with ordered items marked mandatory and evidence-required, classified by scope (universal or one vertical) and optionally by mode and track, and versioned under the generic Version Management service (Section 3.8). A checklist shall not require a gate.</w:t>
       </w:r>
     </w:p>
     <w:p>
@@ -15226,7 +15226,7 @@
           <w:szCs w:val="22"/>
           <w:lang w:val="en-US"/>
         </w:rPr>
-        <w:t xml:space="preserve">The system shall let a template be linked to its stage; linked templates shall be copied into the stage checklist when the stage opens, and a built-in reference checklist shall apply when no template is linked.</w:t>
+        <w:t xml:space="preserve">The system shall let a checklist template be related to zero, one or several gates; the association is made from the gate (FR-DA-GTE-02) or from the checklist, and a checklist associated with a gate shall be copied into that gate's checklist when the phase opens. A built-in reference checklist shall apply to a gate that has no associated checklist.</w:t>
       </w:r>
     </w:p>
     <w:p>
@@ -15259,7 +15259,7 @@
           <w:szCs w:val="22"/>
           <w:lang w:val="en-US"/>
         </w:rPr>
-        <w:t xml:space="preserve">The system shall let an authorized user add items to an open stage checklist from any template or by typing them, never adding the same item twice, and save a stage checklist as a new template.</w:t>
+        <w:t xml:space="preserve">The system shall let an authorized user add items to an open gate or phase checklist from any template or by typing them, never adding the same item twice, and save such a checklist as a new template.</w:t>
       </w:r>
     </w:p>
     <w:p>
@@ -15292,7 +15292,7 @@
           <w:szCs w:val="22"/>
           <w:lang w:val="en-US"/>
         </w:rPr>
-        <w:t xml:space="preserve">The system shall show, for every stage and variant, how many templates exist and how many are linked, and shall seed sector templates for new Organizations of that sector.</w:t>
+        <w:t xml:space="preserve">The system shall show for every checklist the gates it is associated with, and let the library be filtered by gate, by "not related to a gate", by vertical, mode and track; it shall seed sector checklists for new Organizations of that sector.</w:t>
       </w:r>
     </w:p>
     <w:p>
@@ -15325,7 +15325,7 @@
           <w:szCs w:val="22"/>
           <w:lang w:val="en-US"/>
         </w:rPr>
-        <w:t xml:space="preserve">The system shall freeze the checklist, its items and their evidence once the stage has been submitted for decision.</w:t>
+        <w:t xml:space="preserve">The system shall freeze a checklist, its items and their evidence once the gate it belongs to has been submitted for decision or, for a checklist not related to a gate, once it has been signed off.</w:t>
       </w:r>
     </w:p>
     <w:p>
@@ -15358,36 +15358,7 @@
           <w:szCs w:val="22"/>
           <w:lang w:val="en-US"/>
         </w:rPr>
-        <w:t xml:space="preserve">The system shall let a checklist template be attached to any phase of a project or of a project template, not only to a fixed stage, under the rules of Section 4.35.</w:t>
-      </w:r>
-    </w:p>
-    <w:p>
-      <w:pPr>
-        <w:pStyle w:val="Titre2"/>
-        <w:rPr>
-          <w:lang w:val="en-US"/>
-        </w:rPr>
-      </w:pPr>
-      <w:r>
-        <w:rPr>
-          <w:lang w:val="en-US"/>
-        </w:rPr>
-        <w:t xml:space="preserve">4.24 Attachments</w:t>
-      </w:r>
-    </w:p>
-    <w:p>
-      <w:pPr>
-        <w:spacing w:after="160" w:line="276" w:lineRule="auto"/>
-        <w:jc w:val="both"/>
-        <w:rPr>
-          <w:lang w:val="en-US"/>
-        </w:rPr>
-      </w:pPr>
-      <w:r>
-        <w:rPr>
-          <w:lang w:val="en-US"/>
-        </w:rPr>
-        <w:t xml:space="preserve">Actions and checklist items carry the documents that support them.</w:t>
+        <w:t xml:space="preserve">The system shall let a checklist that is not related to any gate be attached directly to a phase, a task or a project, with its completion tracked and reported; such a checklist shall not block any progression.</w:t>
       </w:r>
     </w:p>
     <w:p>
@@ -15412,15 +15383,44 @@
           <w:szCs w:val="22"/>
           <w:lang w:val="en-US"/>
         </w:rPr>
-        <w:t xml:space="preserve">FR-DA-ATT-01: </w:t>
-      </w:r>
-      <w:r>
-        <w:rPr>
-          <w:sz w:val="22"/>
-          <w:szCs w:val="22"/>
-          <w:lang w:val="en-US"/>
-        </w:rPr>
-        <w:t xml:space="preserve">The system shall let a user attach several files at once to an action or a checklist item, by file picker or drag-and-drop.</w:t>
+        <w:t xml:space="preserve">FR-DA-CHK-07: </w:t>
+      </w:r>
+      <w:r>
+        <w:rPr>
+          <w:sz w:val="22"/>
+          <w:szCs w:val="22"/>
+          <w:lang w:val="en-US"/>
+        </w:rPr>
+        <w:t xml:space="preserve">The system shall show, before a checklist is changed or deleted, the gates, templates and open phases that use it; a checklist associated with a published gate shall be retired rather than deleted, and deleting a checklist shall never alter the copies already made in projects.</w:t>
+      </w:r>
+    </w:p>
+    <w:p>
+      <w:pPr>
+        <w:pStyle w:val="Titre2"/>
+        <w:rPr>
+          <w:lang w:val="en-US"/>
+        </w:rPr>
+      </w:pPr>
+      <w:r>
+        <w:rPr>
+          <w:lang w:val="en-US"/>
+        </w:rPr>
+        <w:t xml:space="preserve">4.24 Attachments</w:t>
+      </w:r>
+    </w:p>
+    <w:p>
+      <w:pPr>
+        <w:spacing w:after="160" w:line="276" w:lineRule="auto"/>
+        <w:jc w:val="both"/>
+        <w:rPr>
+          <w:lang w:val="en-US"/>
+        </w:rPr>
+      </w:pPr>
+      <w:r>
+        <w:rPr>
+          <w:lang w:val="en-US"/>
+        </w:rPr>
+        <w:t xml:space="preserve">Actions and checklist items carry the documents that support them.</w:t>
       </w:r>
     </w:p>
     <w:p>
@@ -15445,15 +15445,15 @@
           <w:szCs w:val="22"/>
           <w:lang w:val="en-US"/>
         </w:rPr>
-        <w:t xml:space="preserve">FR-DA-ATT-02: </w:t>
-      </w:r>
-      <w:r>
-        <w:rPr>
-          <w:sz w:val="22"/>
-          <w:szCs w:val="22"/>
-          <w:lang w:val="en-US"/>
-        </w:rPr>
-        <w:t xml:space="preserve">The system shall accept a published list of formats — documents, spreadsheets, presentations, images, drawings and CAD, data and models, archives, audio and video, e-mails — with a size and count limit per upload, and shall refuse any other type with a message naming the refused file.</w:t>
+        <w:t xml:space="preserve">FR-DA-ATT-01: </w:t>
+      </w:r>
+      <w:r>
+        <w:rPr>
+          <w:sz w:val="22"/>
+          <w:szCs w:val="22"/>
+          <w:lang w:val="en-US"/>
+        </w:rPr>
+        <w:t xml:space="preserve">The system shall let a user attach several files at once to an action or a checklist item, by file picker or drag-and-drop.</w:t>
       </w:r>
     </w:p>
     <w:p>
@@ -15478,15 +15478,15 @@
           <w:szCs w:val="22"/>
           <w:lang w:val="en-US"/>
         </w:rPr>
-        <w:t xml:space="preserve">FR-DA-ATT-03: </w:t>
-      </w:r>
-      <w:r>
-        <w:rPr>
-          <w:sz w:val="22"/>
-          <w:szCs w:val="22"/>
-          <w:lang w:val="en-US"/>
-        </w:rPr>
-        <w:t xml:space="preserve">The system shall show for every attachment its type, size, author and date, with download for every viewer and removal for its author or a manager, audited, and never once the stage is submitted.</w:t>
+        <w:t xml:space="preserve">FR-DA-ATT-02: </w:t>
+      </w:r>
+      <w:r>
+        <w:rPr>
+          <w:sz w:val="22"/>
+          <w:szCs w:val="22"/>
+          <w:lang w:val="en-US"/>
+        </w:rPr>
+        <w:t xml:space="preserve">The system shall accept a published list of formats — documents, spreadsheets, presentations, images, drawings and CAD, data and models, archives, audio and video, e-mails — with a size and count limit per upload, and shall refuse any other type with a message naming the refused file.</w:t>
       </w:r>
     </w:p>
     <w:p>
@@ -15511,44 +15511,15 @@
           <w:szCs w:val="22"/>
           <w:lang w:val="en-US"/>
         </w:rPr>
-        <w:t xml:space="preserve">FR-DA-ATT-04: </w:t>
-      </w:r>
-      <w:r>
-        <w:rPr>
-          <w:sz w:val="22"/>
-          <w:szCs w:val="22"/>
-          <w:lang w:val="en-US"/>
-        </w:rPr>
-        <w:t xml:space="preserve">The system shall store attachments outside every web-served directory, scoped to the tenant, and include them in the backup instructions (NFR-DA-SEC-13, FR-DA-OPS-01).</w:t>
-      </w:r>
-    </w:p>
-    <w:p>
-      <w:pPr>
-        <w:pStyle w:val="Titre2"/>
-        <w:rPr>
-          <w:lang w:val="en-US"/>
-        </w:rPr>
-      </w:pPr>
-      <w:r>
-        <w:rPr>
-          <w:lang w:val="en-US"/>
-        </w:rPr>
-        <w:t xml:space="preserve">4.25 Vertical Framework &amp; Governance</w:t>
-      </w:r>
-    </w:p>
-    <w:p>
-      <w:pPr>
-        <w:spacing w:after="160" w:line="276" w:lineRule="auto"/>
-        <w:jc w:val="both"/>
-        <w:rPr>
-          <w:lang w:val="en-US"/>
-        </w:rPr>
-      </w:pPr>
-      <w:r>
-        <w:rPr>
-          <w:lang w:val="en-US"/>
-        </w:rPr>
-        <w:t xml:space="preserve">A vertical is a first-class, governed configuration entity. Its content is data, so any Dynamic App can serve new sectors without code changes.</w:t>
+        <w:t xml:space="preserve">FR-DA-ATT-03: </w:t>
+      </w:r>
+      <w:r>
+        <w:rPr>
+          <w:sz w:val="22"/>
+          <w:szCs w:val="22"/>
+          <w:lang w:val="en-US"/>
+        </w:rPr>
+        <w:t xml:space="preserve">The system shall show for every attachment its type, size, author and date, with download for every viewer and removal for its author or a manager, audited, and never once the stage is submitted.</w:t>
       </w:r>
     </w:p>
     <w:p>
@@ -15573,15 +15544,44 @@
           <w:szCs w:val="22"/>
           <w:lang w:val="en-US"/>
         </w:rPr>
-        <w:t xml:space="preserve">FR-DA-VRT-01: </w:t>
-      </w:r>
-      <w:r>
-        <w:rPr>
-          <w:sz w:val="22"/>
-          <w:szCs w:val="22"/>
-          <w:lang w:val="en-US"/>
-        </w:rPr>
-        <w:t xml:space="preserve">The system shall support the definition of verticals, each with a unique identifier, a short prefix, a name, a description, its target segments, its value proposition, and its associated macro and E2E processes.</w:t>
+        <w:t xml:space="preserve">FR-DA-ATT-04: </w:t>
+      </w:r>
+      <w:r>
+        <w:rPr>
+          <w:sz w:val="22"/>
+          <w:szCs w:val="22"/>
+          <w:lang w:val="en-US"/>
+        </w:rPr>
+        <w:t xml:space="preserve">The system shall store attachments outside every web-served directory, scoped to the tenant, and include them in the backup instructions (NFR-DA-SEC-13, FR-DA-OPS-01).</w:t>
+      </w:r>
+    </w:p>
+    <w:p>
+      <w:pPr>
+        <w:pStyle w:val="Titre2"/>
+        <w:rPr>
+          <w:lang w:val="en-US"/>
+        </w:rPr>
+      </w:pPr>
+      <w:r>
+        <w:rPr>
+          <w:lang w:val="en-US"/>
+        </w:rPr>
+        <w:t xml:space="preserve">4.25 Vertical Framework &amp; Governance</w:t>
+      </w:r>
+    </w:p>
+    <w:p>
+      <w:pPr>
+        <w:spacing w:after="160" w:line="276" w:lineRule="auto"/>
+        <w:jc w:val="both"/>
+        <w:rPr>
+          <w:lang w:val="en-US"/>
+        </w:rPr>
+      </w:pPr>
+      <w:r>
+        <w:rPr>
+          <w:lang w:val="en-US"/>
+        </w:rPr>
+        <w:t xml:space="preserve">A vertical is a first-class, governed configuration entity. Its content is data, so any Dynamic App can serve new sectors without code changes.</w:t>
       </w:r>
     </w:p>
     <w:p>
@@ -15606,15 +15606,15 @@
           <w:szCs w:val="22"/>
           <w:lang w:val="en-US"/>
         </w:rPr>
-        <w:t xml:space="preserve">FR-DA-VRT-02: </w:t>
-      </w:r>
-      <w:r>
-        <w:rPr>
-          <w:sz w:val="22"/>
-          <w:szCs w:val="22"/>
-          <w:lang w:val="en-US"/>
-        </w:rPr>
-        <w:t xml:space="preserve">The system shall support a taxonomy of verticals with parent-child and sibling relationships.</w:t>
+        <w:t xml:space="preserve">FR-DA-VRT-01: </w:t>
+      </w:r>
+      <w:r>
+        <w:rPr>
+          <w:sz w:val="22"/>
+          <w:szCs w:val="22"/>
+          <w:lang w:val="en-US"/>
+        </w:rPr>
+        <w:t xml:space="preserve">The system shall support the definition of verticals, each with a unique identifier, a short prefix, a name, a description, its target segments, its value proposition, and its associated macro and E2E processes.</w:t>
       </w:r>
     </w:p>
     <w:p>
@@ -15639,15 +15639,15 @@
           <w:szCs w:val="22"/>
           <w:lang w:val="en-US"/>
         </w:rPr>
-        <w:t xml:space="preserve">FR-DA-VRT-03: </w:t>
-      </w:r>
-      <w:r>
-        <w:rPr>
-          <w:sz w:val="22"/>
-          <w:szCs w:val="22"/>
-          <w:lang w:val="en-US"/>
-        </w:rPr>
-        <w:t xml:space="preserve">The system shall let administrators and partners define new verticals without modifying the platform, and new verticals shall work alongside existing ones.</w:t>
+        <w:t xml:space="preserve">FR-DA-VRT-02: </w:t>
+      </w:r>
+      <w:r>
+        <w:rPr>
+          <w:sz w:val="22"/>
+          <w:szCs w:val="22"/>
+          <w:lang w:val="en-US"/>
+        </w:rPr>
+        <w:t xml:space="preserve">The system shall support a taxonomy of verticals with parent-child and sibling relationships.</w:t>
       </w:r>
     </w:p>
     <w:p>
@@ -15672,15 +15672,15 @@
           <w:szCs w:val="22"/>
           <w:lang w:val="en-US"/>
         </w:rPr>
-        <w:t xml:space="preserve">FR-DA-VRT-04: </w:t>
-      </w:r>
-      <w:r>
-        <w:rPr>
-          <w:sz w:val="22"/>
-          <w:szCs w:val="22"/>
-          <w:lang w:val="en-US"/>
-        </w:rPr>
-        <w:t xml:space="preserve">The system shall manage each vertical through the lifecycle Draft, Review, Approved, Active, Deprecated and Retired, with an approval workflow (configurable approvers, escalation and notifications) for definition, activation, modification, deprecation and retirement.</w:t>
+        <w:t xml:space="preserve">FR-DA-VRT-03: </w:t>
+      </w:r>
+      <w:r>
+        <w:rPr>
+          <w:sz w:val="22"/>
+          <w:szCs w:val="22"/>
+          <w:lang w:val="en-US"/>
+        </w:rPr>
+        <w:t xml:space="preserve">The system shall let administrators and partners define new verticals without modifying the platform, and new verticals shall work alongside existing ones.</w:t>
       </w:r>
     </w:p>
     <w:p>
@@ -15705,15 +15705,15 @@
           <w:szCs w:val="22"/>
           <w:lang w:val="en-US"/>
         </w:rPr>
-        <w:t xml:space="preserve">FR-DA-VRT-05: </w:t>
-      </w:r>
-      <w:r>
-        <w:rPr>
-          <w:sz w:val="22"/>
-          <w:szCs w:val="22"/>
-          <w:lang w:val="en-US"/>
-        </w:rPr>
-        <w:t xml:space="preserve">The system shall version-control vertical definitions under the Version Management service (Section 3.8), so that every change can be tracked, reviewed, approved and rolled back, including the rollback of an activation or configuration change to a previous version.</w:t>
+        <w:t xml:space="preserve">FR-DA-VRT-04: </w:t>
+      </w:r>
+      <w:r>
+        <w:rPr>
+          <w:sz w:val="22"/>
+          <w:szCs w:val="22"/>
+          <w:lang w:val="en-US"/>
+        </w:rPr>
+        <w:t xml:space="preserve">The system shall manage each vertical through the lifecycle Draft, Review, Approved, Active, Deprecated and Retired, with an approval workflow (configurable approvers, escalation and notifications) for definition, activation, modification, deprecation and retirement.</w:t>
       </w:r>
     </w:p>
     <w:p>
@@ -15738,15 +15738,15 @@
           <w:szCs w:val="22"/>
           <w:lang w:val="en-US"/>
         </w:rPr>
-        <w:t xml:space="preserve">FR-DA-VRT-06: </w:t>
-      </w:r>
-      <w:r>
-        <w:rPr>
-          <w:sz w:val="22"/>
-          <w:szCs w:val="22"/>
-          <w:lang w:val="en-US"/>
-        </w:rPr>
-        <w:t xml:space="preserve">The system shall let each tenant activate its own set of verticals without affecting other tenants.</w:t>
+        <w:t xml:space="preserve">FR-DA-VRT-05: </w:t>
+      </w:r>
+      <w:r>
+        <w:rPr>
+          <w:sz w:val="22"/>
+          <w:szCs w:val="22"/>
+          <w:lang w:val="en-US"/>
+        </w:rPr>
+        <w:t xml:space="preserve">The system shall version-control vertical definitions under the Version Management service (Section 3.8), so that every change can be tracked, reviewed, approved and rolled back, including the rollback of an activation or configuration change to a previous version.</w:t>
       </w:r>
     </w:p>
     <w:p>
@@ -15771,15 +15771,15 @@
           <w:szCs w:val="22"/>
           <w:lang w:val="en-US"/>
         </w:rPr>
-        <w:t xml:space="preserve">FR-DA-VRT-07: </w:t>
-      </w:r>
-      <w:r>
-        <w:rPr>
-          <w:sz w:val="22"/>
-          <w:szCs w:val="22"/>
-          <w:lang w:val="en-US"/>
-        </w:rPr>
-        <w:t xml:space="preserve">The system shall refuse to deactivate a vertical, a macro process or an E2E process while active projects depend on it, shall require approval for a deactivation, and shall preserve all data of a deactivated vertical.</w:t>
+        <w:t xml:space="preserve">FR-DA-VRT-06: </w:t>
+      </w:r>
+      <w:r>
+        <w:rPr>
+          <w:sz w:val="22"/>
+          <w:szCs w:val="22"/>
+          <w:lang w:val="en-US"/>
+        </w:rPr>
+        <w:t xml:space="preserve">The system shall let each tenant activate its own set of verticals without affecting other tenants.</w:t>
       </w:r>
     </w:p>
     <w:p>
@@ -15804,15 +15804,15 @@
           <w:szCs w:val="22"/>
           <w:lang w:val="en-US"/>
         </w:rPr>
-        <w:t xml:space="preserve">FR-DA-VRT-08: </w:t>
-      </w:r>
-      <w:r>
-        <w:rPr>
-          <w:sz w:val="22"/>
-          <w:szCs w:val="22"/>
-          <w:lang w:val="en-US"/>
-        </w:rPr>
-        <w:t xml:space="preserve">The system shall keep an immutable, searchable and exportable audit trail of every vertical action — definition, activation, modification, deactivation and retirement — retained per policy (Section 4.11).</w:t>
+        <w:t xml:space="preserve">FR-DA-VRT-07: </w:t>
+      </w:r>
+      <w:r>
+        <w:rPr>
+          <w:sz w:val="22"/>
+          <w:szCs w:val="22"/>
+          <w:lang w:val="en-US"/>
+        </w:rPr>
+        <w:t xml:space="preserve">The system shall refuse to deactivate a vertical, a macro process or an E2E process while active projects depend on it, shall require approval for a deactivation, and shall preserve all data of a deactivated vertical.</w:t>
       </w:r>
     </w:p>
     <w:p>
@@ -15837,15 +15837,15 @@
           <w:szCs w:val="22"/>
           <w:lang w:val="en-US"/>
         </w:rPr>
-        <w:t xml:space="preserve">FR-DA-VRT-09: </w:t>
-      </w:r>
-      <w:r>
-        <w:rPr>
-          <w:sz w:val="22"/>
-          <w:szCs w:val="22"/>
-          <w:lang w:val="en-US"/>
-        </w:rPr>
-        <w:t xml:space="preserve">The system shall record a designated owner for every vertical and shall support change management for it: change request, impact analysis, approval and tracked implementation.</w:t>
+        <w:t xml:space="preserve">FR-DA-VRT-08: </w:t>
+      </w:r>
+      <w:r>
+        <w:rPr>
+          <w:sz w:val="22"/>
+          <w:szCs w:val="22"/>
+          <w:lang w:val="en-US"/>
+        </w:rPr>
+        <w:t xml:space="preserve">The system shall keep an immutable, searchable and exportable audit trail of every vertical action — definition, activation, modification, deactivation and retirement — retained per policy (Section 4.11).</w:t>
       </w:r>
     </w:p>
     <w:p>
@@ -15870,44 +15870,15 @@
           <w:szCs w:val="22"/>
           <w:lang w:val="en-US"/>
         </w:rPr>
-        <w:t xml:space="preserve">FR-DA-VRT-10: </w:t>
-      </w:r>
-      <w:r>
-        <w:rPr>
-          <w:sz w:val="22"/>
-          <w:szCs w:val="22"/>
-          <w:lang w:val="en-US"/>
-        </w:rPr>
-        <w:t xml:space="preserve">The system shall capture and report governance metrics per vertical: adoption, compliance and performance.</w:t>
-      </w:r>
-    </w:p>
-    <w:p>
-      <w:pPr>
-        <w:pStyle w:val="Titre2"/>
-        <w:rPr>
-          <w:lang w:val="en-US"/>
-        </w:rPr>
-      </w:pPr>
-      <w:r>
-        <w:rPr>
-          <w:lang w:val="en-US"/>
-        </w:rPr>
-        <w:t xml:space="preserve">4.26 Vertical Processes</w:t>
-      </w:r>
-    </w:p>
-    <w:p>
-      <w:pPr>
-        <w:spacing w:after="160" w:line="276" w:lineRule="auto"/>
-        <w:jc w:val="both"/>
-        <w:rPr>
-          <w:lang w:val="en-US"/>
-        </w:rPr>
-      </w:pPr>
-      <w:r>
-        <w:rPr>
-          <w:lang w:val="en-US"/>
-        </w:rPr>
-        <w:t xml:space="preserve">Selecting a vertical activates its own processes, built on the common process model of the application.</w:t>
+        <w:t xml:space="preserve">FR-DA-VRT-09: </w:t>
+      </w:r>
+      <w:r>
+        <w:rPr>
+          <w:sz w:val="22"/>
+          <w:szCs w:val="22"/>
+          <w:lang w:val="en-US"/>
+        </w:rPr>
+        <w:t xml:space="preserve">The system shall record a designated owner for every vertical and shall support change management for it: change request, impact analysis, approval and tracked implementation.</w:t>
       </w:r>
     </w:p>
     <w:p>
@@ -15932,15 +15903,44 @@
           <w:szCs w:val="22"/>
           <w:lang w:val="en-US"/>
         </w:rPr>
-        <w:t xml:space="preserve">FR-DA-VPR-01: </w:t>
-      </w:r>
-      <w:r>
-        <w:rPr>
-          <w:sz w:val="22"/>
-          <w:szCs w:val="22"/>
-          <w:lang w:val="en-US"/>
-        </w:rPr>
-        <w:t xml:space="preserve">The system shall activate the macro processes of a vertical when the vertical is activated, with a configurable range of three to five per vertical.</w:t>
+        <w:t xml:space="preserve">FR-DA-VRT-10: </w:t>
+      </w:r>
+      <w:r>
+        <w:rPr>
+          <w:sz w:val="22"/>
+          <w:szCs w:val="22"/>
+          <w:lang w:val="en-US"/>
+        </w:rPr>
+        <w:t xml:space="preserve">The system shall capture and report governance metrics per vertical: adoption, compliance and performance.</w:t>
+      </w:r>
+    </w:p>
+    <w:p>
+      <w:pPr>
+        <w:pStyle w:val="Titre2"/>
+        <w:rPr>
+          <w:lang w:val="en-US"/>
+        </w:rPr>
+      </w:pPr>
+      <w:r>
+        <w:rPr>
+          <w:lang w:val="en-US"/>
+        </w:rPr>
+        <w:t xml:space="preserve">4.26 Vertical Processes</w:t>
+      </w:r>
+    </w:p>
+    <w:p>
+      <w:pPr>
+        <w:spacing w:after="160" w:line="276" w:lineRule="auto"/>
+        <w:jc w:val="both"/>
+        <w:rPr>
+          <w:lang w:val="en-US"/>
+        </w:rPr>
+      </w:pPr>
+      <w:r>
+        <w:rPr>
+          <w:lang w:val="en-US"/>
+        </w:rPr>
+        <w:t xml:space="preserve">Selecting a vertical activates its own processes, built on the common process model of the application.</w:t>
       </w:r>
     </w:p>
     <w:p>
@@ -15965,15 +15965,15 @@
           <w:szCs w:val="22"/>
           <w:lang w:val="en-US"/>
         </w:rPr>
-        <w:t xml:space="preserve">FR-DA-VPR-02: </w:t>
-      </w:r>
-      <w:r>
-        <w:rPr>
-          <w:sz w:val="22"/>
-          <w:szCs w:val="22"/>
-          <w:lang w:val="en-US"/>
-        </w:rPr>
-        <w:t xml:space="preserve">The system shall describe every vertical macro process with an identifier, name, description, goals, input suppliers, inputs, tasks, outputs, output customers, related E2E processes, related modules and applicable compliance requirements.</w:t>
+        <w:t xml:space="preserve">FR-DA-VPR-01: </w:t>
+      </w:r>
+      <w:r>
+        <w:rPr>
+          <w:sz w:val="22"/>
+          <w:szCs w:val="22"/>
+          <w:lang w:val="en-US"/>
+        </w:rPr>
+        <w:t xml:space="preserve">The system shall activate the macro processes of a vertical when the vertical is activated, with a configurable range of three to five per vertical.</w:t>
       </w:r>
     </w:p>
     <w:p>
@@ -15998,15 +15998,15 @@
           <w:szCs w:val="22"/>
           <w:lang w:val="en-US"/>
         </w:rPr>
-        <w:t xml:space="preserve">FR-DA-VPR-03: </w:t>
-      </w:r>
-      <w:r>
-        <w:rPr>
-          <w:sz w:val="22"/>
-          <w:szCs w:val="22"/>
-          <w:lang w:val="en-US"/>
-        </w:rPr>
-        <w:t xml:space="preserve">The system shall map each vertical macro process to the regulatory and industry standards that apply to it; the mapping shall be configurable and audited.</w:t>
+        <w:t xml:space="preserve">FR-DA-VPR-02: </w:t>
+      </w:r>
+      <w:r>
+        <w:rPr>
+          <w:sz w:val="22"/>
+          <w:szCs w:val="22"/>
+          <w:lang w:val="en-US"/>
+        </w:rPr>
+        <w:t xml:space="preserve">The system shall describe every vertical macro process with an identifier, name, description, goals, input suppliers, inputs, tasks, outputs, output customers, related E2E processes, related modules and applicable compliance requirements.</w:t>
       </w:r>
     </w:p>
     <w:p>
@@ -16031,15 +16031,15 @@
           <w:szCs w:val="22"/>
           <w:lang w:val="en-US"/>
         </w:rPr>
-        <w:t xml:space="preserve">FR-DA-VPR-04: </w:t>
-      </w:r>
-      <w:r>
-        <w:rPr>
-          <w:sz w:val="22"/>
-          <w:szCs w:val="22"/>
-          <w:lang w:val="en-US"/>
-        </w:rPr>
-        <w:t xml:space="preserve">The system shall let administrators and partners add vertical macro processes without modifying the platform, versioned and reversible like verticals (FR-DA-VRT-05).</w:t>
+        <w:t xml:space="preserve">FR-DA-VPR-03: </w:t>
+      </w:r>
+      <w:r>
+        <w:rPr>
+          <w:sz w:val="22"/>
+          <w:szCs w:val="22"/>
+          <w:lang w:val="en-US"/>
+        </w:rPr>
+        <w:t xml:space="preserve">The system shall map each vertical macro process to the regulatory and industry standards that apply to it; the mapping shall be configurable and audited.</w:t>
       </w:r>
     </w:p>
     <w:p>
@@ -16064,15 +16064,15 @@
           <w:szCs w:val="22"/>
           <w:lang w:val="en-US"/>
         </w:rPr>
-        <w:t xml:space="preserve">FR-DA-VPR-05: </w:t>
-      </w:r>
-      <w:r>
-        <w:rPr>
-          <w:sz w:val="22"/>
-          <w:szCs w:val="22"/>
-          <w:lang w:val="en-US"/>
-        </w:rPr>
-        <w:t xml:space="preserve">The system shall support tasks within each macro process (owner, deadline, dependencies, status) and steps within each task (owner, inputs, outputs, status), and shall enforce the dependencies defined between macro processes, tasks and steps.</w:t>
+        <w:t xml:space="preserve">FR-DA-VPR-04: </w:t>
+      </w:r>
+      <w:r>
+        <w:rPr>
+          <w:sz w:val="22"/>
+          <w:szCs w:val="22"/>
+          <w:lang w:val="en-US"/>
+        </w:rPr>
+        <w:t xml:space="preserve">The system shall let administrators and partners add vertical macro processes without modifying the platform, versioned and reversible like verticals (FR-DA-VRT-05).</w:t>
       </w:r>
     </w:p>
     <w:p>
@@ -16097,15 +16097,15 @@
           <w:szCs w:val="22"/>
           <w:lang w:val="en-US"/>
         </w:rPr>
-        <w:t xml:space="preserve">FR-DA-VPR-06: </w:t>
-      </w:r>
-      <w:r>
-        <w:rPr>
-          <w:sz w:val="22"/>
-          <w:szCs w:val="22"/>
-          <w:lang w:val="en-US"/>
-        </w:rPr>
-        <w:t xml:space="preserve">The system shall activate the E2E processes of a vertical when the vertical is activated, with a configurable range of two to four per vertical.</w:t>
+        <w:t xml:space="preserve">FR-DA-VPR-05: </w:t>
+      </w:r>
+      <w:r>
+        <w:rPr>
+          <w:sz w:val="22"/>
+          <w:szCs w:val="22"/>
+          <w:lang w:val="en-US"/>
+        </w:rPr>
+        <w:t xml:space="preserve">The system shall support tasks within each macro process (owner, deadline, dependencies, status) and steps within each task (owner, inputs, outputs, status), and shall enforce the dependencies defined between macro processes, tasks and steps.</w:t>
       </w:r>
     </w:p>
     <w:p>
@@ -16130,15 +16130,15 @@
           <w:szCs w:val="22"/>
           <w:lang w:val="en-US"/>
         </w:rPr>
-        <w:t xml:space="preserve">FR-DA-VPR-07: </w:t>
-      </w:r>
-      <w:r>
-        <w:rPr>
-          <w:sz w:val="22"/>
-          <w:szCs w:val="22"/>
-          <w:lang w:val="en-US"/>
-        </w:rPr>
-        <w:t xml:space="preserve">The system shall enforce the chain relationships between E2E processes — sequential, branching, parallel, loop-back and terminal — and shall support, per E2E process, triggers (business event, time-based, manual) and terminal states (success, failure, cancellation, loop-back).</w:t>
+        <w:t xml:space="preserve">FR-DA-VPR-06: </w:t>
+      </w:r>
+      <w:r>
+        <w:rPr>
+          <w:sz w:val="22"/>
+          <w:szCs w:val="22"/>
+          <w:lang w:val="en-US"/>
+        </w:rPr>
+        <w:t xml:space="preserve">The system shall activate the E2E processes of a vertical when the vertical is activated, with a configurable range of two to four per vertical.</w:t>
       </w:r>
     </w:p>
     <w:p>
@@ -16163,15 +16163,15 @@
           <w:szCs w:val="22"/>
           <w:lang w:val="en-US"/>
         </w:rPr>
-        <w:t xml:space="preserve">FR-DA-VPR-08: </w:t>
-      </w:r>
-      <w:r>
-        <w:rPr>
-          <w:sz w:val="22"/>
-          <w:szCs w:val="22"/>
-          <w:lang w:val="en-US"/>
-        </w:rPr>
-        <w:t xml:space="preserve">The system shall support user-facing tasks in each E2E process, each linked to the macro processes, tasks and steps it relies on.</w:t>
+        <w:t xml:space="preserve">FR-DA-VPR-07: </w:t>
+      </w:r>
+      <w:r>
+        <w:rPr>
+          <w:sz w:val="22"/>
+          <w:szCs w:val="22"/>
+          <w:lang w:val="en-US"/>
+        </w:rPr>
+        <w:t xml:space="preserve">The system shall enforce the chain relationships between E2E processes — sequential, branching, parallel, loop-back and terminal — and shall support, per E2E process, triggers (business event, time-based, manual) and terminal states (success, failure, cancellation, loop-back).</w:t>
       </w:r>
     </w:p>
     <w:p>
@@ -16196,44 +16196,15 @@
           <w:szCs w:val="22"/>
           <w:lang w:val="en-US"/>
         </w:rPr>
-        <w:t xml:space="preserve">FR-DA-VPR-09: </w:t>
-      </w:r>
-      <w:r>
-        <w:rPr>
-          <w:sz w:val="22"/>
-          <w:szCs w:val="22"/>
-          <w:lang w:val="en-US"/>
-        </w:rPr>
-        <w:t xml:space="preserve">The system shall capture metrics for each vertical macro and E2E process — cycle time, completion rate, quality and compliance — and produce status, compliance and performance reports from them (Section 4.8).</w:t>
-      </w:r>
-    </w:p>
-    <w:p>
-      <w:pPr>
-        <w:pStyle w:val="Titre2"/>
-        <w:rPr>
-          <w:lang w:val="en-US"/>
-        </w:rPr>
-      </w:pPr>
-      <w:r>
-        <w:rPr>
-          <w:lang w:val="en-US"/>
-        </w:rPr>
-        <w:t xml:space="preserve">4.27 Vertical Data, Compliance &amp; Integration</w:t>
-      </w:r>
-    </w:p>
-    <w:p>
-      <w:pPr>
-        <w:spacing w:after="160" w:line="276" w:lineRule="auto"/>
-        <w:jc w:val="both"/>
-        <w:rPr>
-          <w:lang w:val="en-US"/>
-        </w:rPr>
-      </w:pPr>
-      <w:r>
-        <w:rPr>
-          <w:lang w:val="en-US"/>
-        </w:rPr>
-        <w:t xml:space="preserve">Each vertical may extend the data model, carry its own compliance obligations and connect to sector systems, always without breaking the common core.</w:t>
+        <w:t xml:space="preserve">FR-DA-VPR-08: </w:t>
+      </w:r>
+      <w:r>
+        <w:rPr>
+          <w:sz w:val="22"/>
+          <w:szCs w:val="22"/>
+          <w:lang w:val="en-US"/>
+        </w:rPr>
+        <w:t xml:space="preserve">The system shall support user-facing tasks in each E2E process, each linked to the macro processes, tasks and steps it relies on.</w:t>
       </w:r>
     </w:p>
     <w:p>
@@ -16258,15 +16229,44 @@
           <w:szCs w:val="22"/>
           <w:lang w:val="en-US"/>
         </w:rPr>
-        <w:t xml:space="preserve">FR-DA-VDT-01: </w:t>
-      </w:r>
-      <w:r>
-        <w:rPr>
-          <w:sz w:val="22"/>
-          <w:szCs w:val="22"/>
-          <w:lang w:val="en-US"/>
-        </w:rPr>
-        <w:t xml:space="preserve">The system shall let a vertical extend the common data model with its own objects, attributes, relationships, validation rules and lifecycle states, without altering or breaking the common entities (Section 6).</w:t>
+        <w:t xml:space="preserve">FR-DA-VPR-09: </w:t>
+      </w:r>
+      <w:r>
+        <w:rPr>
+          <w:sz w:val="22"/>
+          <w:szCs w:val="22"/>
+          <w:lang w:val="en-US"/>
+        </w:rPr>
+        <w:t xml:space="preserve">The system shall capture metrics for each vertical macro and E2E process — cycle time, completion rate, quality and compliance — and produce status, compliance and performance reports from them (Section 4.8).</w:t>
+      </w:r>
+    </w:p>
+    <w:p>
+      <w:pPr>
+        <w:pStyle w:val="Titre2"/>
+        <w:rPr>
+          <w:lang w:val="en-US"/>
+        </w:rPr>
+      </w:pPr>
+      <w:r>
+        <w:rPr>
+          <w:lang w:val="en-US"/>
+        </w:rPr>
+        <w:t xml:space="preserve">4.27 Vertical Data, Compliance &amp; Integration</w:t>
+      </w:r>
+    </w:p>
+    <w:p>
+      <w:pPr>
+        <w:spacing w:after="160" w:line="276" w:lineRule="auto"/>
+        <w:jc w:val="both"/>
+        <w:rPr>
+          <w:lang w:val="en-US"/>
+        </w:rPr>
+      </w:pPr>
+      <w:r>
+        <w:rPr>
+          <w:lang w:val="en-US"/>
+        </w:rPr>
+        <w:t xml:space="preserve">Each vertical may extend the data model, carry its own compliance obligations and connect to sector systems, always without breaking the common core.</w:t>
       </w:r>
     </w:p>
     <w:p>
@@ -16291,15 +16291,15 @@
           <w:szCs w:val="22"/>
           <w:lang w:val="en-US"/>
         </w:rPr>
-        <w:t xml:space="preserve">FR-DA-VDT-02: </w:t>
-      </w:r>
-      <w:r>
-        <w:rPr>
-          <w:sz w:val="22"/>
-          <w:szCs w:val="22"/>
-          <w:lang w:val="en-US"/>
-        </w:rPr>
-        <w:t xml:space="preserve">The system shall exchange vertical data in industry-standard formats, at least JSON, XML, CSV and PDF, and, where the vertical needs it, engineering formats such as STEP, IGES and JT.</w:t>
+        <w:t xml:space="preserve">FR-DA-VDT-01: </w:t>
+      </w:r>
+      <w:r>
+        <w:rPr>
+          <w:sz w:val="22"/>
+          <w:szCs w:val="22"/>
+          <w:lang w:val="en-US"/>
+        </w:rPr>
+        <w:t xml:space="preserve">The system shall let a vertical extend the common data model with its own objects, attributes, relationships, validation rules and lifecycle states, without altering or breaking the common entities (Section 6).</w:t>
       </w:r>
     </w:p>
     <w:p>
@@ -16324,15 +16324,15 @@
           <w:szCs w:val="22"/>
           <w:lang w:val="en-US"/>
         </w:rPr>
-        <w:t xml:space="preserve">FR-DA-VDT-03: </w:t>
-      </w:r>
-      <w:r>
-        <w:rPr>
-          <w:sz w:val="22"/>
-          <w:szCs w:val="22"/>
-          <w:lang w:val="en-US"/>
-        </w:rPr>
-        <w:t xml:space="preserve">The system shall apply per-vertical retention policies and support archiving and retrieval of vertical data, in line with the regulatory retention of the sector.</w:t>
+        <w:t xml:space="preserve">FR-DA-VDT-02: </w:t>
+      </w:r>
+      <w:r>
+        <w:rPr>
+          <w:sz w:val="22"/>
+          <w:szCs w:val="22"/>
+          <w:lang w:val="en-US"/>
+        </w:rPr>
+        <w:t xml:space="preserve">The system shall exchange vertical data in industry-standard formats, at least JSON, XML, CSV and PDF, and, where the vertical needs it, engineering formats such as STEP, IGES and JT.</w:t>
       </w:r>
     </w:p>
     <w:p>
@@ -16357,15 +16357,15 @@
           <w:szCs w:val="22"/>
           <w:lang w:val="en-US"/>
         </w:rPr>
-        <w:t xml:space="preserve">FR-DA-VCP-01: </w:t>
-      </w:r>
-      <w:r>
-        <w:rPr>
-          <w:sz w:val="22"/>
-          <w:szCs w:val="22"/>
-          <w:lang w:val="en-US"/>
-        </w:rPr>
-        <w:t xml:space="preserve">The system shall support vertical-specific regulations and standards as configurable, audited and reportable compliance requirements, subject to FR-DA-CFG-09.</w:t>
+        <w:t xml:space="preserve">FR-DA-VDT-03: </w:t>
+      </w:r>
+      <w:r>
+        <w:rPr>
+          <w:sz w:val="22"/>
+          <w:szCs w:val="22"/>
+          <w:lang w:val="en-US"/>
+        </w:rPr>
+        <w:t xml:space="preserve">The system shall apply per-vertical retention policies and support archiving and retrieval of vertical data, in line with the regulatory retention of the sector.</w:t>
       </w:r>
     </w:p>
     <w:p>
@@ -16390,15 +16390,15 @@
           <w:szCs w:val="22"/>
           <w:lang w:val="en-US"/>
         </w:rPr>
-        <w:t xml:space="preserve">FR-DA-VCP-02: </w:t>
-      </w:r>
-      <w:r>
-        <w:rPr>
-          <w:sz w:val="22"/>
-          <w:szCs w:val="22"/>
-          <w:lang w:val="en-US"/>
-        </w:rPr>
-        <w:t xml:space="preserve">The system shall monitor compliance per vertical, alert stakeholders of non-compliance through the Notification Center (Section 4.9), and produce compliance reports, audit reports and certification records.</w:t>
+        <w:t xml:space="preserve">FR-DA-VCP-01: </w:t>
+      </w:r>
+      <w:r>
+        <w:rPr>
+          <w:sz w:val="22"/>
+          <w:szCs w:val="22"/>
+          <w:lang w:val="en-US"/>
+        </w:rPr>
+        <w:t xml:space="preserve">The system shall support vertical-specific regulations and standards as configurable, audited and reportable compliance requirements, subject to FR-DA-CFG-09.</w:t>
       </w:r>
     </w:p>
     <w:p>
@@ -16423,15 +16423,15 @@
           <w:szCs w:val="22"/>
           <w:lang w:val="en-US"/>
         </w:rPr>
-        <w:t xml:space="preserve">FR-DA-VCP-03: </w:t>
-      </w:r>
-      <w:r>
-        <w:rPr>
-          <w:sz w:val="22"/>
-          <w:szCs w:val="22"/>
-          <w:lang w:val="en-US"/>
-        </w:rPr>
-        <w:t xml:space="preserve">The system shall support internal and external compliance audits — planning, execution, findings and corrective actions — and vertical compliance training with content, delivery, tracking and certification.</w:t>
+        <w:t xml:space="preserve">FR-DA-VCP-02: </w:t>
+      </w:r>
+      <w:r>
+        <w:rPr>
+          <w:sz w:val="22"/>
+          <w:szCs w:val="22"/>
+          <w:lang w:val="en-US"/>
+        </w:rPr>
+        <w:t xml:space="preserve">The system shall monitor compliance per vertical, alert stakeholders of non-compliance through the Notification Center (Section 4.9), and produce compliance reports, audit reports and certification records.</w:t>
       </w:r>
     </w:p>
     <w:p>
@@ -16456,15 +16456,15 @@
           <w:szCs w:val="22"/>
           <w:lang w:val="en-US"/>
         </w:rPr>
-        <w:t xml:space="preserve">FR-DA-VIN-01: </w:t>
-      </w:r>
-      <w:r>
-        <w:rPr>
-          <w:sz w:val="22"/>
-          <w:szCs w:val="22"/>
-          <w:lang w:val="en-US"/>
-        </w:rPr>
-        <w:t xml:space="preserve">The system shall connect vertical-specific external systems through standard interfaces (REST, SOAP, GraphQL, file-based, message-based), under the integration rules of FR-DA-CFG-10 to 14.</w:t>
+        <w:t xml:space="preserve">FR-DA-VCP-03: </w:t>
+      </w:r>
+      <w:r>
+        <w:rPr>
+          <w:sz w:val="22"/>
+          <w:szCs w:val="22"/>
+          <w:lang w:val="en-US"/>
+        </w:rPr>
+        <w:t xml:space="preserve">The system shall support internal and external compliance audits — planning, execution, findings and corrective actions — and vertical compliance training with content, delivery, tracking and certification.</w:t>
       </w:r>
     </w:p>
     <w:p>
@@ -16489,44 +16489,15 @@
           <w:szCs w:val="22"/>
           <w:lang w:val="en-US"/>
         </w:rPr>
-        <w:t xml:space="preserve">FR-DA-VIN-02: </w:t>
-      </w:r>
-      <w:r>
-        <w:rPr>
-          <w:sz w:val="22"/>
-          <w:szCs w:val="22"/>
-          <w:lang w:val="en-US"/>
-        </w:rPr>
-        <w:t xml:space="preserve">The system shall secure, monitor (performance, errors, data quality) and test every vertical integration, and shall handle integration errors by retry, fallback and notification.</w:t>
-      </w:r>
-    </w:p>
-    <w:p>
-      <w:pPr>
-        <w:pStyle w:val="Titre2"/>
-        <w:rPr>
-          <w:lang w:val="en-US"/>
-        </w:rPr>
-      </w:pPr>
-      <w:r>
-        <w:rPr>
-          <w:lang w:val="en-US"/>
-        </w:rPr>
-        <w:t xml:space="preserve">4.28 Vertical Configuration</w:t>
-      </w:r>
-    </w:p>
-    <w:p>
-      <w:pPr>
-        <w:spacing w:after="160" w:line="276" w:lineRule="auto"/>
-        <w:jc w:val="both"/>
-        <w:rPr>
-          <w:lang w:val="en-US"/>
-        </w:rPr>
-      </w:pPr>
-      <w:r>
-        <w:rPr>
-          <w:lang w:val="en-US"/>
-        </w:rPr>
-        <w:t xml:space="preserve">Vertical parameters are configured, validated and versioned before activation.</w:t>
+        <w:t xml:space="preserve">FR-DA-VIN-01: </w:t>
+      </w:r>
+      <w:r>
+        <w:rPr>
+          <w:sz w:val="22"/>
+          <w:szCs w:val="22"/>
+          <w:lang w:val="en-US"/>
+        </w:rPr>
+        <w:t xml:space="preserve">The system shall connect vertical-specific external systems through standard interfaces (REST, SOAP, GraphQL, file-based, message-based), under the integration rules of FR-DA-CFG-10 to 14.</w:t>
       </w:r>
     </w:p>
     <w:p>
@@ -16551,15 +16522,44 @@
           <w:szCs w:val="22"/>
           <w:lang w:val="en-US"/>
         </w:rPr>
-        <w:t xml:space="preserve">FR-DA-VCF-01: </w:t>
-      </w:r>
-      <w:r>
-        <w:rPr>
-          <w:sz w:val="22"/>
-          <w:szCs w:val="22"/>
-          <w:lang w:val="en-US"/>
-        </w:rPr>
-        <w:t xml:space="preserve">The system shall let an administrator configure, per vertical: macro and E2E process activation, checklist templates, gate criteria and data model extensions.</w:t>
+        <w:t xml:space="preserve">FR-DA-VIN-02: </w:t>
+      </w:r>
+      <w:r>
+        <w:rPr>
+          <w:sz w:val="22"/>
+          <w:szCs w:val="22"/>
+          <w:lang w:val="en-US"/>
+        </w:rPr>
+        <w:t xml:space="preserve">The system shall secure, monitor (performance, errors, data quality) and test every vertical integration, and shall handle integration errors by retry, fallback and notification.</w:t>
+      </w:r>
+    </w:p>
+    <w:p>
+      <w:pPr>
+        <w:pStyle w:val="Titre2"/>
+        <w:rPr>
+          <w:lang w:val="en-US"/>
+        </w:rPr>
+      </w:pPr>
+      <w:r>
+        <w:rPr>
+          <w:lang w:val="en-US"/>
+        </w:rPr>
+        <w:t xml:space="preserve">4.28 Vertical Configuration</w:t>
+      </w:r>
+    </w:p>
+    <w:p>
+      <w:pPr>
+        <w:spacing w:after="160" w:line="276" w:lineRule="auto"/>
+        <w:jc w:val="both"/>
+        <w:rPr>
+          <w:lang w:val="en-US"/>
+        </w:rPr>
+      </w:pPr>
+      <w:r>
+        <w:rPr>
+          <w:lang w:val="en-US"/>
+        </w:rPr>
+        <w:t xml:space="preserve">Vertical parameters are configured, validated and versioned before activation.</w:t>
       </w:r>
     </w:p>
     <w:p>
@@ -16584,15 +16584,15 @@
           <w:szCs w:val="22"/>
           <w:lang w:val="en-US"/>
         </w:rPr>
-        <w:t xml:space="preserve">FR-DA-VCF-02: </w:t>
-      </w:r>
-      <w:r>
-        <w:rPr>
-          <w:sz w:val="22"/>
-          <w:szCs w:val="22"/>
-          <w:lang w:val="en-US"/>
-        </w:rPr>
-        <w:t xml:space="preserve">The system shall provide a pre-built configuration template per vertical for rapid deployment.</w:t>
+        <w:t xml:space="preserve">FR-DA-VCF-01: </w:t>
+      </w:r>
+      <w:r>
+        <w:rPr>
+          <w:sz w:val="22"/>
+          <w:szCs w:val="22"/>
+          <w:lang w:val="en-US"/>
+        </w:rPr>
+        <w:t xml:space="preserve">The system shall let an administrator configure, per vertical: macro and E2E process activation, checklist templates, gate criteria and data model extensions.</w:t>
       </w:r>
     </w:p>
     <w:p>
@@ -16617,15 +16617,15 @@
           <w:szCs w:val="22"/>
           <w:lang w:val="en-US"/>
         </w:rPr>
-        <w:t xml:space="preserve">FR-DA-VCF-03: </w:t>
-      </w:r>
-      <w:r>
-        <w:rPr>
-          <w:sz w:val="22"/>
-          <w:szCs w:val="22"/>
-          <w:lang w:val="en-US"/>
-        </w:rPr>
-        <w:t xml:space="preserve">The system shall validate a vertical configuration for completeness, consistency and compliance before activation, and shall refuse an activation that fails validation, naming each failed rule.</w:t>
+        <w:t xml:space="preserve">FR-DA-VCF-02: </w:t>
+      </w:r>
+      <w:r>
+        <w:rPr>
+          <w:sz w:val="22"/>
+          <w:szCs w:val="22"/>
+          <w:lang w:val="en-US"/>
+        </w:rPr>
+        <w:t xml:space="preserve">The system shall provide a pre-built configuration template per vertical for rapid deployment.</w:t>
       </w:r>
     </w:p>
     <w:p>
@@ -16650,44 +16650,15 @@
           <w:szCs w:val="22"/>
           <w:lang w:val="en-US"/>
         </w:rPr>
-        <w:t xml:space="preserve">FR-DA-VCF-04: </w:t>
-      </w:r>
-      <w:r>
-        <w:rPr>
-          <w:sz w:val="22"/>
-          <w:szCs w:val="22"/>
-          <w:lang w:val="en-US"/>
-        </w:rPr>
-        <w:t xml:space="preserve">The system shall version every vertical configuration change and audit who changed what, when and why.</w:t>
-      </w:r>
-    </w:p>
-    <w:p>
-      <w:pPr>
-        <w:pStyle w:val="Titre2"/>
-        <w:rPr>
-          <w:lang w:val="en-US"/>
-        </w:rPr>
-      </w:pPr>
-      <w:r>
-        <w:rPr>
-          <w:lang w:val="en-US"/>
-        </w:rPr>
-        <w:t xml:space="preserve">4.29 SME Mode &amp; Tracks</w:t>
-      </w:r>
-    </w:p>
-    <w:p>
-      <w:pPr>
-        <w:spacing w:after="160" w:line="276" w:lineRule="auto"/>
-        <w:jc w:val="both"/>
-        <w:rPr>
-          <w:lang w:val="en-US"/>
-        </w:rPr>
-      </w:pPr>
-      <w:r>
-        <w:rPr>
-          <w:lang w:val="en-US"/>
-        </w:rPr>
-        <w:t xml:space="preserve">The SME mode is a cross-sector enabler: an SME in any vertical can run it alongside that vertical.</w:t>
+        <w:t xml:space="preserve">FR-DA-VCF-03: </w:t>
+      </w:r>
+      <w:r>
+        <w:rPr>
+          <w:sz w:val="22"/>
+          <w:szCs w:val="22"/>
+          <w:lang w:val="en-US"/>
+        </w:rPr>
+        <w:t xml:space="preserve">The system shall validate a vertical configuration for completeness, consistency and compliance before activation, and shall refuse an activation that fails validation, naming each failed rule.</w:t>
       </w:r>
     </w:p>
     <w:p>
@@ -16712,15 +16683,44 @@
           <w:szCs w:val="22"/>
           <w:lang w:val="en-US"/>
         </w:rPr>
-        <w:t xml:space="preserve">FR-DA-SME-01: </w:t>
-      </w:r>
-      <w:r>
-        <w:rPr>
-          <w:sz w:val="22"/>
-          <w:szCs w:val="22"/>
-          <w:lang w:val="en-US"/>
-        </w:rPr>
-        <w:t xml:space="preserve">The system shall define an SME by configurable employee thresholds per region (default 1–250 in the EU, up to 500 under the US SBA definition) and shall segment SMEs into Micro (1–10), Small (10–50) and Medium (50–250).</w:t>
+        <w:t xml:space="preserve">FR-DA-VCF-04: </w:t>
+      </w:r>
+      <w:r>
+        <w:rPr>
+          <w:sz w:val="22"/>
+          <w:szCs w:val="22"/>
+          <w:lang w:val="en-US"/>
+        </w:rPr>
+        <w:t xml:space="preserve">The system shall version every vertical configuration change and audit who changed what, when and why.</w:t>
+      </w:r>
+    </w:p>
+    <w:p>
+      <w:pPr>
+        <w:pStyle w:val="Titre2"/>
+        <w:rPr>
+          <w:lang w:val="en-US"/>
+        </w:rPr>
+      </w:pPr>
+      <w:r>
+        <w:rPr>
+          <w:lang w:val="en-US"/>
+        </w:rPr>
+        <w:t xml:space="preserve">4.29 SME Mode &amp; Tracks</w:t>
+      </w:r>
+    </w:p>
+    <w:p>
+      <w:pPr>
+        <w:spacing w:after="160" w:line="276" w:lineRule="auto"/>
+        <w:jc w:val="both"/>
+        <w:rPr>
+          <w:lang w:val="en-US"/>
+        </w:rPr>
+      </w:pPr>
+      <w:r>
+        <w:rPr>
+          <w:lang w:val="en-US"/>
+        </w:rPr>
+        <w:t xml:space="preserve">The SME mode is a cross-sector enabler: an SME in any vertical can run it alongside that vertical.</w:t>
       </w:r>
     </w:p>
     <w:p>
@@ -16745,15 +16745,15 @@
           <w:szCs w:val="22"/>
           <w:lang w:val="en-US"/>
         </w:rPr>
-        <w:t xml:space="preserve">FR-DA-SME-02: </w:t>
-      </w:r>
-      <w:r>
-        <w:rPr>
-          <w:sz w:val="22"/>
-          <w:szCs w:val="22"/>
-          <w:lang w:val="en-US"/>
-        </w:rPr>
-        <w:t xml:space="preserve">The system shall let an Organization activate the SME mode together with any vertical, and each tenant shall activate its own tracks and configuration without affecting other tenants.</w:t>
+        <w:t xml:space="preserve">FR-DA-SME-01: </w:t>
+      </w:r>
+      <w:r>
+        <w:rPr>
+          <w:sz w:val="22"/>
+          <w:szCs w:val="22"/>
+          <w:lang w:val="en-US"/>
+        </w:rPr>
+        <w:t xml:space="preserve">The system shall define an SME by configurable employee thresholds per region (default 1–250 in the EU, up to 500 under the US SBA definition) and shall segment SMEs into Micro (1–10), Small (10–50) and Medium (50–250).</w:t>
       </w:r>
     </w:p>
     <w:p>
@@ -16778,15 +16778,15 @@
           <w:szCs w:val="22"/>
           <w:lang w:val="en-US"/>
         </w:rPr>
-        <w:t xml:space="preserve">FR-DA-SME-03: </w:t>
-      </w:r>
-      <w:r>
-        <w:rPr>
-          <w:sz w:val="22"/>
-          <w:szCs w:val="22"/>
-          <w:lang w:val="en-US"/>
-        </w:rPr>
-        <w:t xml:space="preserve">The system shall support two to four configurable SME tracks, each defining its number of macro processes, E2E processes, gates, checklist items per gate, and typical duration.</w:t>
+        <w:t xml:space="preserve">FR-DA-SME-02: </w:t>
+      </w:r>
+      <w:r>
+        <w:rPr>
+          <w:sz w:val="22"/>
+          <w:szCs w:val="22"/>
+          <w:lang w:val="en-US"/>
+        </w:rPr>
+        <w:t xml:space="preserve">The system shall let an Organization activate the SME mode together with any vertical, and each tenant shall activate its own tracks and configuration without affecting other tenants.</w:t>
       </w:r>
     </w:p>
     <w:p>
@@ -16811,15 +16811,15 @@
           <w:szCs w:val="22"/>
           <w:lang w:val="en-US"/>
         </w:rPr>
-        <w:t xml:space="preserve">FR-DA-SME-04: </w:t>
-      </w:r>
-      <w:r>
-        <w:rPr>
-          <w:sz w:val="22"/>
-          <w:szCs w:val="22"/>
-          <w:lang w:val="en-US"/>
-        </w:rPr>
-        <w:t xml:space="preserve">The system shall activate three to five SME macro processes and two to six SME E2E processes when a track is selected, with the same taxonomy, task, step, chain and metric rules as vertical processes (FR-DA-VPR-02, 05, 07, 08 and 09) plus track applicability and cost metrics.</w:t>
+        <w:t xml:space="preserve">FR-DA-SME-03: </w:t>
+      </w:r>
+      <w:r>
+        <w:rPr>
+          <w:sz w:val="22"/>
+          <w:szCs w:val="22"/>
+          <w:lang w:val="en-US"/>
+        </w:rPr>
+        <w:t xml:space="preserve">The system shall support two to four configurable SME tracks, each defining its number of macro processes, E2E processes, gates, checklist items per gate, and typical duration.</w:t>
       </w:r>
     </w:p>
     <w:p>
@@ -16844,15 +16844,15 @@
           <w:szCs w:val="22"/>
           <w:lang w:val="en-US"/>
         </w:rPr>
-        <w:t xml:space="preserve">FR-DA-SME-05: </w:t>
-      </w:r>
-      <w:r>
-        <w:rPr>
-          <w:sz w:val="22"/>
-          <w:szCs w:val="22"/>
-          <w:lang w:val="en-US"/>
-        </w:rPr>
-        <w:t xml:space="preserve">The system shall let administrators define new SME tracks, macro processes and configurations without modifying the platform.</w:t>
+        <w:t xml:space="preserve">FR-DA-SME-04: </w:t>
+      </w:r>
+      <w:r>
+        <w:rPr>
+          <w:sz w:val="22"/>
+          <w:szCs w:val="22"/>
+          <w:lang w:val="en-US"/>
+        </w:rPr>
+        <w:t xml:space="preserve">The system shall activate three to five SME macro processes and two to six SME E2E processes when a track is selected, with the same taxonomy, task, step, chain and metric rules as vertical processes (FR-DA-VPR-02, 05, 07, 08 and 09) plus track applicability and cost metrics.</w:t>
       </w:r>
     </w:p>
     <w:p>
@@ -16877,15 +16877,15 @@
           <w:szCs w:val="22"/>
           <w:lang w:val="en-US"/>
         </w:rPr>
-        <w:t xml:space="preserve">FR-DA-SME-06: </w:t>
-      </w:r>
-      <w:r>
-        <w:rPr>
-          <w:sz w:val="22"/>
-          <w:szCs w:val="22"/>
-          <w:lang w:val="en-US"/>
-        </w:rPr>
-        <w:t xml:space="preserve">The system shall assign a project in SME mode to the track recommended by its complexity score (Section 4.30); a manual override shall require a written justification and an approval, and shall be audited and reportable.</w:t>
+        <w:t xml:space="preserve">FR-DA-SME-05: </w:t>
+      </w:r>
+      <w:r>
+        <w:rPr>
+          <w:sz w:val="22"/>
+          <w:szCs w:val="22"/>
+          <w:lang w:val="en-US"/>
+        </w:rPr>
+        <w:t xml:space="preserve">The system shall let administrators define new SME tracks, macro processes and configurations without modifying the platform.</w:t>
       </w:r>
     </w:p>
     <w:p>
@@ -16910,15 +16910,15 @@
           <w:szCs w:val="22"/>
           <w:lang w:val="en-US"/>
         </w:rPr>
-        <w:t xml:space="preserve">FR-DA-SME-07: </w:t>
-      </w:r>
-      <w:r>
-        <w:rPr>
-          <w:sz w:val="22"/>
-          <w:szCs w:val="22"/>
-          <w:lang w:val="en-US"/>
-        </w:rPr>
-        <w:t xml:space="preserve">The system shall capture and report, per track, its usage, effectiveness and outcomes.</w:t>
+        <w:t xml:space="preserve">FR-DA-SME-06: </w:t>
+      </w:r>
+      <w:r>
+        <w:rPr>
+          <w:sz w:val="22"/>
+          <w:szCs w:val="22"/>
+          <w:lang w:val="en-US"/>
+        </w:rPr>
+        <w:t xml:space="preserve">The system shall assign a project in SME mode to the track recommended by its complexity score (Section 4.30); a manual override shall require a written justification and an approval, and shall be audited and reportable.</w:t>
       </w:r>
     </w:p>
     <w:p>
@@ -16943,44 +16943,15 @@
           <w:szCs w:val="22"/>
           <w:lang w:val="en-US"/>
         </w:rPr>
-        <w:t xml:space="preserve">FR-DA-SME-08: </w:t>
-      </w:r>
-      <w:r>
-        <w:rPr>
-          <w:sz w:val="22"/>
-          <w:szCs w:val="22"/>
-          <w:lang w:val="en-US"/>
-        </w:rPr>
-        <w:t xml:space="preserve">The system shall govern the SME framework like verticals: a designated owner, an approval workflow for track definition, activation, modification, deprecation and retirement, change management, an immutable audit trail and adoption, compliance and performance metrics.</w:t>
-      </w:r>
-    </w:p>
-    <w:p>
-      <w:pPr>
-        <w:pStyle w:val="Titre2"/>
-        <w:rPr>
-          <w:lang w:val="en-US"/>
-        </w:rPr>
-      </w:pPr>
-      <w:r>
-        <w:rPr>
-          <w:lang w:val="en-US"/>
-        </w:rPr>
-        <w:t xml:space="preserve">4.30 Complexity Scoring</w:t>
-      </w:r>
-    </w:p>
-    <w:p>
-      <w:pPr>
-        <w:spacing w:after="160" w:line="276" w:lineRule="auto"/>
-        <w:jc w:val="both"/>
-        <w:rPr>
-          <w:lang w:val="en-US"/>
-        </w:rPr>
-      </w:pPr>
-      <w:r>
-        <w:rPr>
-          <w:lang w:val="en-US"/>
-        </w:rPr>
-        <w:t xml:space="preserve">A complexity score gives every project the right amount of rigor, consistently and traceably.</w:t>
+        <w:t xml:space="preserve">FR-DA-SME-07: </w:t>
+      </w:r>
+      <w:r>
+        <w:rPr>
+          <w:sz w:val="22"/>
+          <w:szCs w:val="22"/>
+          <w:lang w:val="en-US"/>
+        </w:rPr>
+        <w:t xml:space="preserve">The system shall capture and report, per track, its usage, effectiveness and outcomes.</w:t>
       </w:r>
     </w:p>
     <w:p>
@@ -17005,15 +16976,44 @@
           <w:szCs w:val="22"/>
           <w:lang w:val="en-US"/>
         </w:rPr>
-        <w:t xml:space="preserve">FR-DA-SCO-01: </w:t>
-      </w:r>
-      <w:r>
-        <w:rPr>
-          <w:sz w:val="22"/>
-          <w:szCs w:val="22"/>
-          <w:lang w:val="en-US"/>
-        </w:rPr>
-        <w:t xml:space="preserve">The system shall compute a complexity score for every project from weighted criteria and shall use it to recommend the mode and track.</w:t>
+        <w:t xml:space="preserve">FR-DA-SME-08: </w:t>
+      </w:r>
+      <w:r>
+        <w:rPr>
+          <w:sz w:val="22"/>
+          <w:szCs w:val="22"/>
+          <w:lang w:val="en-US"/>
+        </w:rPr>
+        <w:t xml:space="preserve">The system shall govern the SME framework like verticals: a designated owner, an approval workflow for track definition, activation, modification, deprecation and retirement, change management, an immutable audit trail and adoption, compliance and performance metrics.</w:t>
+      </w:r>
+    </w:p>
+    <w:p>
+      <w:pPr>
+        <w:pStyle w:val="Titre2"/>
+        <w:rPr>
+          <w:lang w:val="en-US"/>
+        </w:rPr>
+      </w:pPr>
+      <w:r>
+        <w:rPr>
+          <w:lang w:val="en-US"/>
+        </w:rPr>
+        <w:t xml:space="preserve">4.30 Complexity Scoring</w:t>
+      </w:r>
+    </w:p>
+    <w:p>
+      <w:pPr>
+        <w:spacing w:after="160" w:line="276" w:lineRule="auto"/>
+        <w:jc w:val="both"/>
+        <w:rPr>
+          <w:lang w:val="en-US"/>
+        </w:rPr>
+      </w:pPr>
+      <w:r>
+        <w:rPr>
+          <w:lang w:val="en-US"/>
+        </w:rPr>
+        <w:t xml:space="preserve">A complexity score gives every project the right amount of rigor, consistently and traceably.</w:t>
       </w:r>
     </w:p>
     <w:p>
@@ -17038,15 +17038,15 @@
           <w:szCs w:val="22"/>
           <w:lang w:val="en-US"/>
         </w:rPr>
-        <w:t xml:space="preserve">FR-DA-SCO-02: </w:t>
-      </w:r>
-      <w:r>
-        <w:rPr>
-          <w:sz w:val="22"/>
-          <w:szCs w:val="22"/>
-          <w:lang w:val="en-US"/>
-        </w:rPr>
-        <w:t xml:space="preserve">The system shall let an administrator configure the criteria — at least strategic impact, technical novelty, regulatory burden, investment size, cross-functional scope, market uncertainty and time-to-market pressure — and their weights, which shall sum to 100 %; a set of weights that does not sum to 100 % shall be refused.</w:t>
+        <w:t xml:space="preserve">FR-DA-SCO-01: </w:t>
+      </w:r>
+      <w:r>
+        <w:rPr>
+          <w:sz w:val="22"/>
+          <w:szCs w:val="22"/>
+          <w:lang w:val="en-US"/>
+        </w:rPr>
+        <w:t xml:space="preserve">The system shall compute a complexity score for every project from weighted criteria and shall use it to recommend the mode and track.</w:t>
       </w:r>
     </w:p>
     <w:p>
@@ -17071,15 +17071,15 @@
           <w:szCs w:val="22"/>
           <w:lang w:val="en-US"/>
         </w:rPr>
-        <w:t xml:space="preserve">FR-DA-SCO-03: </w:t>
-      </w:r>
-      <w:r>
-        <w:rPr>
-          <w:sz w:val="22"/>
-          <w:szCs w:val="22"/>
-          <w:lang w:val="en-US"/>
-        </w:rPr>
-        <w:t xml:space="preserve">The system shall let each vertical add its own complexity drivers (for example regulatory burden, industry standards, sector-specific risks) with their weights, versioned, so that the score and the recommended track reflect the vertical of the project.</w:t>
+        <w:t xml:space="preserve">FR-DA-SCO-02: </w:t>
+      </w:r>
+      <w:r>
+        <w:rPr>
+          <w:sz w:val="22"/>
+          <w:szCs w:val="22"/>
+          <w:lang w:val="en-US"/>
+        </w:rPr>
+        <w:t xml:space="preserve">The system shall let an administrator configure the criteria — at least strategic impact, technical novelty, regulatory burden, investment size, cross-functional scope, market uncertainty and time-to-market pressure — and their weights, which shall sum to 100 %; a set of weights that does not sum to 100 % shall be refused.</w:t>
       </w:r>
     </w:p>
     <w:p>
@@ -17104,44 +17104,15 @@
           <w:szCs w:val="22"/>
           <w:lang w:val="en-US"/>
         </w:rPr>
-        <w:t xml:space="preserve">FR-DA-SCO-04: </w:t>
-      </w:r>
-      <w:r>
-        <w:rPr>
-          <w:sz w:val="22"/>
-          <w:szCs w:val="22"/>
-          <w:lang w:val="en-US"/>
-        </w:rPr>
-        <w:t xml:space="preserve">The system shall keep an audit trail of every score — criteria, weights, values, result and track assignment — and shall report the distribution of scores, track assignments and outcomes.</w:t>
-      </w:r>
-    </w:p>
-    <w:p>
-      <w:pPr>
-        <w:pStyle w:val="Titre2"/>
-        <w:rPr>
-          <w:lang w:val="en-US"/>
-        </w:rPr>
-      </w:pPr>
-      <w:r>
-        <w:rPr>
-          <w:lang w:val="en-US"/>
-        </w:rPr>
-        <w:t xml:space="preserve">4.31 SME Onboarding &amp; Experience</w:t>
-      </w:r>
-    </w:p>
-    <w:p>
-      <w:pPr>
-        <w:spacing w:after="160" w:line="276" w:lineRule="auto"/>
-        <w:jc w:val="both"/>
-        <w:rPr>
-          <w:lang w:val="en-US"/>
-        </w:rPr>
-      </w:pPr>
-      <w:r>
-        <w:rPr>
-          <w:lang w:val="en-US"/>
-        </w:rPr>
-        <w:t xml:space="preserve">SMEs need to go live quickly with little PLM experience.</w:t>
+        <w:t xml:space="preserve">FR-DA-SCO-03: </w:t>
+      </w:r>
+      <w:r>
+        <w:rPr>
+          <w:sz w:val="22"/>
+          <w:szCs w:val="22"/>
+          <w:lang w:val="en-US"/>
+        </w:rPr>
+        <w:t xml:space="preserve">The system shall let each vertical add its own complexity drivers (for example regulatory burden, industry standards, sector-specific risks) with their weights, versioned, so that the score and the recommended track reflect the vertical of the project.</w:t>
       </w:r>
     </w:p>
     <w:p>
@@ -17166,15 +17137,44 @@
           <w:szCs w:val="22"/>
           <w:lang w:val="en-US"/>
         </w:rPr>
-        <w:t xml:space="preserve">FR-DA-ONB-01: </w:t>
-      </w:r>
-      <w:r>
-        <w:rPr>
-          <w:sz w:val="22"/>
-          <w:szCs w:val="22"/>
-          <w:lang w:val="en-US"/>
-        </w:rPr>
-        <w:t xml:space="preserve">The system shall run an onboarding plan for an SME within a configurable period (default 30 days): tenant provisioning (FR-DA-TEN-14), track configuration, data import, validation, user training and go-live.</w:t>
+        <w:t xml:space="preserve">FR-DA-SCO-04: </w:t>
+      </w:r>
+      <w:r>
+        <w:rPr>
+          <w:sz w:val="22"/>
+          <w:szCs w:val="22"/>
+          <w:lang w:val="en-US"/>
+        </w:rPr>
+        <w:t xml:space="preserve">The system shall keep an audit trail of every score — criteria, weights, values, result and track assignment — and shall report the distribution of scores, track assignments and outcomes.</w:t>
+      </w:r>
+    </w:p>
+    <w:p>
+      <w:pPr>
+        <w:pStyle w:val="Titre2"/>
+        <w:rPr>
+          <w:lang w:val="en-US"/>
+        </w:rPr>
+      </w:pPr>
+      <w:r>
+        <w:rPr>
+          <w:lang w:val="en-US"/>
+        </w:rPr>
+        <w:t xml:space="preserve">4.31 SME Onboarding &amp; Experience</w:t>
+      </w:r>
+    </w:p>
+    <w:p>
+      <w:pPr>
+        <w:spacing w:after="160" w:line="276" w:lineRule="auto"/>
+        <w:jc w:val="both"/>
+        <w:rPr>
+          <w:lang w:val="en-US"/>
+        </w:rPr>
+      </w:pPr>
+      <w:r>
+        <w:rPr>
+          <w:lang w:val="en-US"/>
+        </w:rPr>
+        <w:t xml:space="preserve">SMEs need to go live quickly with little PLM experience.</w:t>
       </w:r>
     </w:p>
     <w:p>
@@ -17199,15 +17199,15 @@
           <w:szCs w:val="22"/>
           <w:lang w:val="en-US"/>
         </w:rPr>
-        <w:t xml:space="preserve">FR-DA-ONB-02: </w:t>
-      </w:r>
-      <w:r>
-        <w:rPr>
-          <w:sz w:val="22"/>
-          <w:szCs w:val="22"/>
-          <w:lang w:val="en-US"/>
-        </w:rPr>
-        <w:t xml:space="preserve">The system shall import data from spreadsheets, CSV files, legacy systems and cloud storage, preserving data integrity and relationships, and shall validate the imported data for completeness, consistency and accuracy before go-live, listing every rejected record with its reason.</w:t>
+        <w:t xml:space="preserve">FR-DA-ONB-01: </w:t>
+      </w:r>
+      <w:r>
+        <w:rPr>
+          <w:sz w:val="22"/>
+          <w:szCs w:val="22"/>
+          <w:lang w:val="en-US"/>
+        </w:rPr>
+        <w:t xml:space="preserve">The system shall run an onboarding plan for an SME within a configurable period (default 30 days): tenant provisioning (FR-DA-TEN-14), track configuration, data import, validation, user training and go-live.</w:t>
       </w:r>
     </w:p>
     <w:p>
@@ -17232,15 +17232,15 @@
           <w:szCs w:val="22"/>
           <w:lang w:val="en-US"/>
         </w:rPr>
-        <w:t xml:space="preserve">FR-DA-ONB-03: </w:t>
-      </w:r>
-      <w:r>
-        <w:rPr>
-          <w:sz w:val="22"/>
-          <w:szCs w:val="22"/>
-          <w:lang w:val="en-US"/>
-        </w:rPr>
-        <w:t xml:space="preserve">The system shall provide self-service training and guided onboarding: interactive tutorials, guided workflows, sample data and contextual help (Section 4.12).</w:t>
+        <w:t xml:space="preserve">FR-DA-ONB-02: </w:t>
+      </w:r>
+      <w:r>
+        <w:rPr>
+          <w:sz w:val="22"/>
+          <w:szCs w:val="22"/>
+          <w:lang w:val="en-US"/>
+        </w:rPr>
+        <w:t xml:space="preserve">The system shall import data from spreadsheets, CSV files, legacy systems and cloud storage, preserving data integrity and relationships, and shall validate the imported data for completeness, consistency and accuracy before go-live, listing every rejected record with its reason.</w:t>
       </w:r>
     </w:p>
     <w:p>
@@ -17265,15 +17265,15 @@
           <w:szCs w:val="22"/>
           <w:lang w:val="en-US"/>
         </w:rPr>
-        <w:t xml:space="preserve">FR-DA-ONB-04: </w:t>
-      </w:r>
-      <w:r>
-        <w:rPr>
-          <w:sz w:val="22"/>
-          <w:szCs w:val="22"/>
-          <w:lang w:val="en-US"/>
-        </w:rPr>
-        <w:t xml:space="preserve">The system shall offer SME users simplified navigation, a mobile-responsive or progressive web app experience, and self-service support through the knowledge base, the AI Assistant (Section 4.10) and a community space.</w:t>
+        <w:t xml:space="preserve">FR-DA-ONB-03: </w:t>
+      </w:r>
+      <w:r>
+        <w:rPr>
+          <w:sz w:val="22"/>
+          <w:szCs w:val="22"/>
+          <w:lang w:val="en-US"/>
+        </w:rPr>
+        <w:t xml:space="preserve">The system shall provide self-service training and guided onboarding: interactive tutorials, guided workflows, sample data and contextual help (Section 4.12).</w:t>
       </w:r>
     </w:p>
     <w:p>
@@ -17298,44 +17298,15 @@
           <w:szCs w:val="22"/>
           <w:lang w:val="en-US"/>
         </w:rPr>
-        <w:t xml:space="preserve">FR-DA-ONB-05: </w:t>
-      </w:r>
-      <w:r>
-        <w:rPr>
-          <w:sz w:val="22"/>
-          <w:szCs w:val="22"/>
-          <w:lang w:val="en-US"/>
-        </w:rPr>
-        <w:t xml:space="preserve">The system shall measure onboarding: time-to-value, data quality, user adoption and satisfaction.</w:t>
-      </w:r>
-    </w:p>
-    <w:p>
-      <w:pPr>
-        <w:pStyle w:val="Titre2"/>
-        <w:rPr>
-          <w:lang w:val="en-US"/>
-        </w:rPr>
-      </w:pPr>
-      <w:r>
-        <w:rPr>
-          <w:lang w:val="en-US"/>
-        </w:rPr>
-        <w:t xml:space="preserve">4.32 Packaging &amp; Pricing</w:t>
-      </w:r>
-    </w:p>
-    <w:p>
-      <w:pPr>
-        <w:spacing w:after="160" w:line="276" w:lineRule="auto"/>
-        <w:jc w:val="both"/>
-        <w:rPr>
-          <w:lang w:val="en-US"/>
-        </w:rPr>
-      </w:pPr>
-      <w:r>
-        <w:rPr>
-          <w:lang w:val="en-US"/>
-        </w:rPr>
-        <w:t xml:space="preserve">SME packs, vertical packs and their bundles extend the Solution Pack model of Section 4.3.</w:t>
+        <w:t xml:space="preserve">FR-DA-ONB-04: </w:t>
+      </w:r>
+      <w:r>
+        <w:rPr>
+          <w:sz w:val="22"/>
+          <w:szCs w:val="22"/>
+          <w:lang w:val="en-US"/>
+        </w:rPr>
+        <w:t xml:space="preserve">The system shall offer SME users simplified navigation, a mobile-responsive or progressive web app experience, and self-service support through the knowledge base, the AI Assistant (Section 4.10) and a community space.</w:t>
       </w:r>
     </w:p>
     <w:p>
@@ -17360,15 +17331,44 @@
           <w:szCs w:val="22"/>
           <w:lang w:val="en-US"/>
         </w:rPr>
-        <w:t xml:space="preserve">FR-DA-PKG-01: </w:t>
-      </w:r>
-      <w:r>
-        <w:rPr>
-          <w:sz w:val="22"/>
-          <w:szCs w:val="22"/>
-          <w:lang w:val="en-US"/>
-        </w:rPr>
-        <w:t xml:space="preserve">The system shall let an administrator define three to five SME packs, each with configurable contents, target segment and price, and bundles of a vertical pack with an SME pack, each recorded as a Solution Pack variant so that entitlement stays enforced by FR-DA-CFG-06.</w:t>
+        <w:t xml:space="preserve">FR-DA-ONB-05: </w:t>
+      </w:r>
+      <w:r>
+        <w:rPr>
+          <w:sz w:val="22"/>
+          <w:szCs w:val="22"/>
+          <w:lang w:val="en-US"/>
+        </w:rPr>
+        <w:t xml:space="preserve">The system shall measure onboarding: time-to-value, data quality, user adoption and satisfaction.</w:t>
+      </w:r>
+    </w:p>
+    <w:p>
+      <w:pPr>
+        <w:pStyle w:val="Titre2"/>
+        <w:rPr>
+          <w:lang w:val="en-US"/>
+        </w:rPr>
+      </w:pPr>
+      <w:r>
+        <w:rPr>
+          <w:lang w:val="en-US"/>
+        </w:rPr>
+        <w:t xml:space="preserve">4.32 Packaging &amp; Pricing</w:t>
+      </w:r>
+    </w:p>
+    <w:p>
+      <w:pPr>
+        <w:spacing w:after="160" w:line="276" w:lineRule="auto"/>
+        <w:jc w:val="both"/>
+        <w:rPr>
+          <w:lang w:val="en-US"/>
+        </w:rPr>
+      </w:pPr>
+      <w:r>
+        <w:rPr>
+          <w:lang w:val="en-US"/>
+        </w:rPr>
+        <w:t xml:space="preserve">SME packs, vertical packs and their bundles extend the Solution Pack model of Section 4.3.</w:t>
       </w:r>
     </w:p>
     <w:p>
@@ -17393,15 +17393,15 @@
           <w:szCs w:val="22"/>
           <w:lang w:val="en-US"/>
         </w:rPr>
-        <w:t xml:space="preserve">FR-DA-PKG-02: </w:t>
-      </w:r>
-      <w:r>
-        <w:rPr>
-          <w:sz w:val="22"/>
-          <w:szCs w:val="22"/>
-          <w:lang w:val="en-US"/>
-        </w:rPr>
-        <w:t xml:space="preserve">The system shall enforce configurable pricing rules — minimum price per user per month, minimum user count per pack, volume discounts and bundle discounts — and shall show how each price was obtained.</w:t>
+        <w:t xml:space="preserve">FR-DA-PKG-01: </w:t>
+      </w:r>
+      <w:r>
+        <w:rPr>
+          <w:sz w:val="22"/>
+          <w:szCs w:val="22"/>
+          <w:lang w:val="en-US"/>
+        </w:rPr>
+        <w:t xml:space="preserve">The system shall let an administrator define three to five SME packs, each with configurable contents, target segment and price, and bundles of a vertical pack with an SME pack, each recorded as a Solution Pack variant so that entitlement stays enforced by FR-DA-CFG-06.</w:t>
       </w:r>
     </w:p>
     <w:p>
@@ -17426,15 +17426,15 @@
           <w:szCs w:val="22"/>
           <w:lang w:val="en-US"/>
         </w:rPr>
-        <w:t xml:space="preserve">FR-DA-PKG-03: </w:t>
-      </w:r>
-      <w:r>
-        <w:rPr>
-          <w:sz w:val="22"/>
-          <w:szCs w:val="22"/>
-          <w:lang w:val="en-US"/>
-        </w:rPr>
-        <w:t xml:space="preserve">The system shall support upgrading and downgrading between packs and bundles with prorated billing and without loss of data.</w:t>
+        <w:t xml:space="preserve">FR-DA-PKG-02: </w:t>
+      </w:r>
+      <w:r>
+        <w:rPr>
+          <w:sz w:val="22"/>
+          <w:szCs w:val="22"/>
+          <w:lang w:val="en-US"/>
+        </w:rPr>
+        <w:t xml:space="preserve">The system shall enforce configurable pricing rules — minimum price per user per month, minimum user count per pack, volume discounts and bundle discounts — and shall show how each price was obtained.</w:t>
       </w:r>
     </w:p>
     <w:p>
@@ -17459,44 +17459,15 @@
           <w:szCs w:val="22"/>
           <w:lang w:val="en-US"/>
         </w:rPr>
-        <w:t xml:space="preserve">FR-DA-PKG-04: </w:t>
-      </w:r>
-      <w:r>
-        <w:rPr>
-          <w:sz w:val="22"/>
-          <w:szCs w:val="22"/>
-          <w:lang w:val="en-US"/>
-        </w:rPr>
-        <w:t xml:space="preserve">The system shall report revenue, discounts, adoption, upgrades and downgrades per pack and bundle, exportable to PDF, XML and CSV.</w:t>
-      </w:r>
-    </w:p>
-    <w:p>
-      <w:pPr>
-        <w:pStyle w:val="Titre2"/>
-        <w:rPr>
-          <w:lang w:val="en-US"/>
-        </w:rPr>
-      </w:pPr>
-      <w:r>
-        <w:rPr>
-          <w:lang w:val="en-US"/>
-        </w:rPr>
-        <w:t xml:space="preserve">4.33 Project Template Catalog</w:t>
-      </w:r>
-    </w:p>
-    <w:p>
-      <w:pPr>
-        <w:spacing w:after="160" w:line="276" w:lineRule="auto"/>
-        <w:jc w:val="both"/>
-        <w:rPr>
-          <w:lang w:val="en-US"/>
-        </w:rPr>
-      </w:pPr>
-      <w:r>
-        <w:rPr>
-          <w:lang w:val="en-US"/>
-        </w:rPr>
-        <w:t xml:space="preserve">Every Dynamic App offers a catalog of project templates. A template is a starting point copied at creation time (FR-DA-TPL-04).</w:t>
+        <w:t xml:space="preserve">FR-DA-PKG-03: </w:t>
+      </w:r>
+      <w:r>
+        <w:rPr>
+          <w:sz w:val="22"/>
+          <w:szCs w:val="22"/>
+          <w:lang w:val="en-US"/>
+        </w:rPr>
+        <w:t xml:space="preserve">The system shall support upgrading and downgrading between packs and bundles with prorated billing and without loss of data.</w:t>
       </w:r>
     </w:p>
     <w:p>
@@ -17521,15 +17492,44 @@
           <w:szCs w:val="22"/>
           <w:lang w:val="en-US"/>
         </w:rPr>
-        <w:t xml:space="preserve">FR-DA-PTC-01: </w:t>
-      </w:r>
-      <w:r>
-        <w:rPr>
-          <w:sz w:val="22"/>
-          <w:szCs w:val="22"/>
-          <w:lang w:val="en-US"/>
-        </w:rPr>
-        <w:t xml:space="preserve">The system shall keep a Project Template Catalog in which every template is classified by scope — Universal (common to all sectors) or one Vertical — and by mode — Full, or SME with its track.</w:t>
+        <w:t xml:space="preserve">FR-DA-PKG-04: </w:t>
+      </w:r>
+      <w:r>
+        <w:rPr>
+          <w:sz w:val="22"/>
+          <w:szCs w:val="22"/>
+          <w:lang w:val="en-US"/>
+        </w:rPr>
+        <w:t xml:space="preserve">The system shall report revenue, discounts, adoption, upgrades and downgrades per pack and bundle, exportable to PDF, XML and CSV.</w:t>
+      </w:r>
+    </w:p>
+    <w:p>
+      <w:pPr>
+        <w:pStyle w:val="Titre2"/>
+        <w:rPr>
+          <w:lang w:val="en-US"/>
+        </w:rPr>
+      </w:pPr>
+      <w:r>
+        <w:rPr>
+          <w:lang w:val="en-US"/>
+        </w:rPr>
+        <w:t xml:space="preserve">4.33 Project Template Catalog</w:t>
+      </w:r>
+    </w:p>
+    <w:p>
+      <w:pPr>
+        <w:spacing w:after="160" w:line="276" w:lineRule="auto"/>
+        <w:jc w:val="both"/>
+        <w:rPr>
+          <w:lang w:val="en-US"/>
+        </w:rPr>
+      </w:pPr>
+      <w:r>
+        <w:rPr>
+          <w:lang w:val="en-US"/>
+        </w:rPr>
+        <w:t xml:space="preserve">Every Dynamic App offers a catalog of project templates. A template is a starting point copied at creation time (FR-DA-TPL-04).</w:t>
       </w:r>
     </w:p>
     <w:p>
@@ -17554,15 +17554,15 @@
           <w:szCs w:val="22"/>
           <w:lang w:val="en-US"/>
         </w:rPr>
-        <w:t xml:space="preserve">FR-DA-PTC-02: </w:t>
-      </w:r>
-      <w:r>
-        <w:rPr>
-          <w:sz w:val="22"/>
-          <w:szCs w:val="22"/>
-          <w:lang w:val="en-US"/>
-        </w:rPr>
-        <w:t xml:space="preserve">The system shall support full Create, Read, Update, Delete and Duplicate on project templates, versioned under Section 3.8; a template shall carry its default fields, its phases, the gates and checklists attached to each phase (Section 4.35), its OBS roles and its milestones.</w:t>
+        <w:t xml:space="preserve">FR-DA-PTC-01: </w:t>
+      </w:r>
+      <w:r>
+        <w:rPr>
+          <w:sz w:val="22"/>
+          <w:szCs w:val="22"/>
+          <w:lang w:val="en-US"/>
+        </w:rPr>
+        <w:t xml:space="preserve">The system shall keep a Project Template Catalog in which every template is classified by scope — Universal (common to all sectors) or one Vertical — and by mode — Full, or SME with its track.</w:t>
       </w:r>
     </w:p>
     <w:p>
@@ -17587,15 +17587,15 @@
           <w:szCs w:val="22"/>
           <w:lang w:val="en-US"/>
         </w:rPr>
-        <w:t xml:space="preserve">FR-DA-PTC-03: </w:t>
-      </w:r>
-      <w:r>
-        <w:rPr>
-          <w:sz w:val="22"/>
-          <w:szCs w:val="22"/>
-          <w:lang w:val="en-US"/>
-        </w:rPr>
-        <w:t xml:space="preserve">The system shall present the catalog as a browsable list with search and filters on scope, vertical, mode, track and status, a preview of each template's phases, gates and checklists, and its use count.</w:t>
+        <w:t xml:space="preserve">FR-DA-PTC-02: </w:t>
+      </w:r>
+      <w:r>
+        <w:rPr>
+          <w:sz w:val="22"/>
+          <w:szCs w:val="22"/>
+          <w:lang w:val="en-US"/>
+        </w:rPr>
+        <w:t xml:space="preserve">The system shall support full Create, Read, Update, Delete and Duplicate on project templates, versioned under Section 3.8; a template shall carry its default fields, its phases, the gates (Section 4.35) and checklists (Section 4.23) attached to each phase, its OBS roles and its milestones.</w:t>
       </w:r>
     </w:p>
     <w:p>
@@ -17620,15 +17620,15 @@
           <w:szCs w:val="22"/>
           <w:lang w:val="en-US"/>
         </w:rPr>
-        <w:t xml:space="preserve">FR-DA-PTC-04: </w:t>
-      </w:r>
-      <w:r>
-        <w:rPr>
-          <w:sz w:val="22"/>
-          <w:szCs w:val="22"/>
-          <w:lang w:val="en-US"/>
-        </w:rPr>
-        <w:t xml:space="preserve">The system shall manage each template through Draft, Published and Retired; only published templates shall be offered at project creation, and retiring a template shall not change any project created from it.</w:t>
+        <w:t xml:space="preserve">FR-DA-PTC-03: </w:t>
+      </w:r>
+      <w:r>
+        <w:rPr>
+          <w:sz w:val="22"/>
+          <w:szCs w:val="22"/>
+          <w:lang w:val="en-US"/>
+        </w:rPr>
+        <w:t xml:space="preserve">The system shall present the catalog as a browsable list with search and filters on scope, vertical, mode, track and status, a preview of each template's phases, gates and checklists, and its use count.</w:t>
       </w:r>
     </w:p>
     <w:p>
@@ -17653,15 +17653,15 @@
           <w:szCs w:val="22"/>
           <w:lang w:val="en-US"/>
         </w:rPr>
-        <w:t xml:space="preserve">FR-DA-PTC-05: </w:t>
-      </w:r>
-      <w:r>
-        <w:rPr>
-          <w:sz w:val="22"/>
-          <w:szCs w:val="22"/>
-          <w:lang w:val="en-US"/>
-        </w:rPr>
-        <w:t xml:space="preserve">The system shall provide universal templates for Full and SME mode on every installation, seed vertical templates when a vertical is activated, and let an authorized user save an existing project as a new template.</w:t>
+        <w:t xml:space="preserve">FR-DA-PTC-04: </w:t>
+      </w:r>
+      <w:r>
+        <w:rPr>
+          <w:sz w:val="22"/>
+          <w:szCs w:val="22"/>
+          <w:lang w:val="en-US"/>
+        </w:rPr>
+        <w:t xml:space="preserve">The system shall manage each template through Draft, Published and Retired; only published templates shall be offered at project creation, and retiring a template shall not change any project created from it.</w:t>
       </w:r>
     </w:p>
     <w:p>
@@ -17686,44 +17686,15 @@
           <w:szCs w:val="22"/>
           <w:lang w:val="en-US"/>
         </w:rPr>
-        <w:t xml:space="preserve">FR-DA-PTC-06: </w:t>
-      </w:r>
-      <w:r>
-        <w:rPr>
-          <w:sz w:val="22"/>
-          <w:szCs w:val="22"/>
-          <w:lang w:val="en-US"/>
-        </w:rPr>
-        <w:t xml:space="preserve">The system shall restrict catalog changes to a dedicated permission, audit every change, and let platform templates be shared read-only with all Organizations while Organization templates stay private to their tenant.</w:t>
-      </w:r>
-    </w:p>
-    <w:p>
-      <w:pPr>
-        <w:pStyle w:val="Titre2"/>
-        <w:rPr>
-          <w:lang w:val="en-US"/>
-        </w:rPr>
-      </w:pPr>
-      <w:r>
-        <w:rPr>
-          <w:lang w:val="en-US"/>
-        </w:rPr>
-        <w:t xml:space="preserve">4.34 Project Creation Modes</w:t>
-      </w:r>
-    </w:p>
-    <w:p>
-      <w:pPr>
-        <w:spacing w:after="160" w:line="276" w:lineRule="auto"/>
-        <w:jc w:val="both"/>
-        <w:rPr>
-          <w:lang w:val="en-US"/>
-        </w:rPr>
-      </w:pPr>
-      <w:r>
-        <w:rPr>
-          <w:lang w:val="en-US"/>
-        </w:rPr>
-        <w:t xml:space="preserve">A project can be created in three ways; all three end in the same, fully editable project.</w:t>
+        <w:t xml:space="preserve">FR-DA-PTC-05: </w:t>
+      </w:r>
+      <w:r>
+        <w:rPr>
+          <w:sz w:val="22"/>
+          <w:szCs w:val="22"/>
+          <w:lang w:val="en-US"/>
+        </w:rPr>
+        <w:t xml:space="preserve">The system shall provide universal templates for Full and SME mode on every installation, seed vertical templates when a vertical is activated, and let an authorized user save an existing project as a new template.</w:t>
       </w:r>
     </w:p>
     <w:p>
@@ -17748,15 +17719,44 @@
           <w:szCs w:val="22"/>
           <w:lang w:val="en-US"/>
         </w:rPr>
-        <w:t xml:space="preserve">FR-DA-PCM-01: </w:t>
-      </w:r>
-      <w:r>
-        <w:rPr>
-          <w:sz w:val="22"/>
-          <w:szCs w:val="22"/>
-          <w:lang w:val="en-US"/>
-        </w:rPr>
-        <w:t xml:space="preserve">The system shall offer three creation modes on one entry point: From the catalog, Manual, and With AI.</w:t>
+        <w:t xml:space="preserve">FR-DA-PTC-06: </w:t>
+      </w:r>
+      <w:r>
+        <w:rPr>
+          <w:sz w:val="22"/>
+          <w:szCs w:val="22"/>
+          <w:lang w:val="en-US"/>
+        </w:rPr>
+        <w:t xml:space="preserve">The system shall restrict catalog changes to a dedicated permission, audit every change, and let platform templates be shared read-only with all Organizations while Organization templates stay private to their tenant.</w:t>
+      </w:r>
+    </w:p>
+    <w:p>
+      <w:pPr>
+        <w:pStyle w:val="Titre2"/>
+        <w:rPr>
+          <w:lang w:val="en-US"/>
+        </w:rPr>
+      </w:pPr>
+      <w:r>
+        <w:rPr>
+          <w:lang w:val="en-US"/>
+        </w:rPr>
+        <w:t xml:space="preserve">4.34 Project Creation Modes</w:t>
+      </w:r>
+    </w:p>
+    <w:p>
+      <w:pPr>
+        <w:spacing w:after="160" w:line="276" w:lineRule="auto"/>
+        <w:jc w:val="both"/>
+        <w:rPr>
+          <w:lang w:val="en-US"/>
+        </w:rPr>
+      </w:pPr>
+      <w:r>
+        <w:rPr>
+          <w:lang w:val="en-US"/>
+        </w:rPr>
+        <w:t xml:space="preserve">A project can be created in three ways; all three end in the same, fully editable project.</w:t>
       </w:r>
     </w:p>
     <w:p>
@@ -17781,15 +17781,15 @@
           <w:szCs w:val="22"/>
           <w:lang w:val="en-US"/>
         </w:rPr>
-        <w:t xml:space="preserve">FR-DA-PCM-02: </w:t>
-      </w:r>
-      <w:r>
-        <w:rPr>
-          <w:sz w:val="22"/>
-          <w:szCs w:val="22"/>
-          <w:lang w:val="en-US"/>
-        </w:rPr>
-        <w:t xml:space="preserve">From the catalog: the system shall propose the templates that match the Organization's verticals and the project's mode and track, and copy the chosen template's fields, phases, gates, checklists and roles into the new project.</w:t>
+        <w:t xml:space="preserve">FR-DA-PCM-01: </w:t>
+      </w:r>
+      <w:r>
+        <w:rPr>
+          <w:sz w:val="22"/>
+          <w:szCs w:val="22"/>
+          <w:lang w:val="en-US"/>
+        </w:rPr>
+        <w:t xml:space="preserve">The system shall offer three creation modes on one entry point: From the catalog, Manual, and With AI.</w:t>
       </w:r>
     </w:p>
     <w:p>
@@ -17814,15 +17814,15 @@
           <w:szCs w:val="22"/>
           <w:lang w:val="en-US"/>
         </w:rPr>
-        <w:t xml:space="preserve">FR-DA-PCM-03: </w:t>
-      </w:r>
-      <w:r>
-        <w:rPr>
-          <w:sz w:val="22"/>
-          <w:szCs w:val="22"/>
-          <w:lang w:val="en-US"/>
-        </w:rPr>
-        <w:t xml:space="preserve">Manual: the system shall let the user enter the project and choose its vertical (or none), mode and track, and build its phases by attaching gates and checklists from the library or creating new ones.</w:t>
+        <w:t xml:space="preserve">FR-DA-PCM-02: </w:t>
+      </w:r>
+      <w:r>
+        <w:rPr>
+          <w:sz w:val="22"/>
+          <w:szCs w:val="22"/>
+          <w:lang w:val="en-US"/>
+        </w:rPr>
+        <w:t xml:space="preserve">From the catalog: the system shall propose the templates that match the Organization's verticals and the project's mode and track, and copy the chosen template's fields, phases, gates, checklists and roles into the new project.</w:t>
       </w:r>
     </w:p>
     <w:p>
@@ -17847,15 +17847,15 @@
           <w:szCs w:val="22"/>
           <w:lang w:val="en-US"/>
         </w:rPr>
-        <w:t xml:space="preserve">FR-DA-PCM-04: </w:t>
-      </w:r>
-      <w:r>
-        <w:rPr>
-          <w:sz w:val="22"/>
-          <w:szCs w:val="22"/>
-          <w:lang w:val="en-US"/>
-        </w:rPr>
-        <w:t xml:space="preserve">With AI: the system shall draft the project — fields, complexity scores, recommended mode and track, closest template, phases, gates and checklists — from a short description, as an Assistive AI suggestion that the user accepts, modifies or rejects item by item before anything is saved (FR-DA-AI-07); the draft shall work with the built-in engine and use the live model when configured.</w:t>
+        <w:t xml:space="preserve">FR-DA-PCM-03: </w:t>
+      </w:r>
+      <w:r>
+        <w:rPr>
+          <w:sz w:val="22"/>
+          <w:szCs w:val="22"/>
+          <w:lang w:val="en-US"/>
+        </w:rPr>
+        <w:t xml:space="preserve">Manual: the system shall let the user enter the project and choose its vertical (or none), mode and track, and build its phases by attaching gates from the Gate Library and checklists from the Checklist Library, or by creating new ones.</w:t>
       </w:r>
     </w:p>
     <w:p>
@@ -17880,44 +17880,15 @@
           <w:szCs w:val="22"/>
           <w:lang w:val="en-US"/>
         </w:rPr>
-        <w:t xml:space="preserve">FR-DA-PCM-05: </w:t>
-      </w:r>
-      <w:r>
-        <w:rPr>
-          <w:sz w:val="22"/>
-          <w:szCs w:val="22"/>
-          <w:lang w:val="en-US"/>
-        </w:rPr>
-        <w:t xml:space="preserve">The system shall compute the complexity score (Section 4.30) in every creation mode, apply the quota checks of NFR-DA-SEC-08, and record in the audit trail the creation mode, the template and version used, and the AI suggestions accepted.</w:t>
-      </w:r>
-    </w:p>
-    <w:p>
-      <w:pPr>
-        <w:pStyle w:val="Titre2"/>
-        <w:rPr>
-          <w:lang w:val="en-US"/>
-        </w:rPr>
-      </w:pPr>
-      <w:r>
-        <w:rPr>
-          <w:lang w:val="en-US"/>
-        </w:rPr>
-        <w:t xml:space="preserve">4.35 Gate &amp; Checklist Library</w:t>
-      </w:r>
-    </w:p>
-    <w:p>
-      <w:pPr>
-        <w:spacing w:after="160" w:line="276" w:lineRule="auto"/>
-        <w:jc w:val="both"/>
-        <w:rPr>
-          <w:lang w:val="en-US"/>
-        </w:rPr>
-      </w:pPr>
-      <w:r>
-        <w:rPr>
-          <w:lang w:val="en-US"/>
-        </w:rPr>
-        <w:t xml:space="preserve">Gates and checklists are reusable library entries, created once and attached to any phase of any project or template.</w:t>
+        <w:t xml:space="preserve">FR-DA-PCM-04: </w:t>
+      </w:r>
+      <w:r>
+        <w:rPr>
+          <w:sz w:val="22"/>
+          <w:szCs w:val="22"/>
+          <w:lang w:val="en-US"/>
+        </w:rPr>
+        <w:t xml:space="preserve">With AI: the system shall draft the project — fields, complexity scores, recommended mode and track, closest template, phases, gates and checklists — from a short description, as an Assistive AI suggestion that the user accepts, modifies or rejects item by item before anything is saved (FR-DA-AI-07); the draft shall work with the built-in engine and use the live model when configured.</w:t>
       </w:r>
     </w:p>
     <w:p>
@@ -17942,15 +17913,44 @@
           <w:szCs w:val="22"/>
           <w:lang w:val="en-US"/>
         </w:rPr>
-        <w:t xml:space="preserve">FR-DA-GTE-01: </w:t>
-      </w:r>
-      <w:r>
-        <w:rPr>
-          <w:sz w:val="22"/>
-          <w:szCs w:val="22"/>
-          <w:lang w:val="en-US"/>
-        </w:rPr>
-        <w:t xml:space="preserve">The system shall keep a library of gate definitions with full Create, Read, Update, Delete and Duplicate, versioned: name, purpose, entry and exit criteria, approvers (roles or people), decision options Go, No-Go, Hold and Recycle, and applicability by vertical, mode and track.</w:t>
+        <w:t xml:space="preserve">FR-DA-PCM-05: </w:t>
+      </w:r>
+      <w:r>
+        <w:rPr>
+          <w:sz w:val="22"/>
+          <w:szCs w:val="22"/>
+          <w:lang w:val="en-US"/>
+        </w:rPr>
+        <w:t xml:space="preserve">The system shall compute the complexity score (Section 4.30) in every creation mode, apply the quota checks of NFR-DA-SEC-08, and record in the audit trail the creation mode, the template and version used, and the AI suggestions accepted.</w:t>
+      </w:r>
+    </w:p>
+    <w:p>
+      <w:pPr>
+        <w:pStyle w:val="Titre2"/>
+        <w:rPr>
+          <w:lang w:val="en-US"/>
+        </w:rPr>
+      </w:pPr>
+      <w:r>
+        <w:rPr>
+          <w:lang w:val="en-US"/>
+        </w:rPr>
+        <w:t xml:space="preserve">4.35 Gate Library</w:t>
+      </w:r>
+    </w:p>
+    <w:p>
+      <w:pPr>
+        <w:spacing w:after="160" w:line="276" w:lineRule="auto"/>
+        <w:jc w:val="both"/>
+        <w:rPr>
+          <w:lang w:val="en-US"/>
+        </w:rPr>
+      </w:pPr>
+      <w:r>
+        <w:rPr>
+          <w:lang w:val="en-US"/>
+        </w:rPr>
+        <w:t xml:space="preserve">The Gate Library holds every gate definition. Checklists from the Checklist Library (Section 4.23) are associated with a gate; gates are then attached to any phase of any project or project template.</w:t>
       </w:r>
     </w:p>
     <w:p>
@@ -17975,15 +17975,15 @@
           <w:szCs w:val="22"/>
           <w:lang w:val="en-US"/>
         </w:rPr>
-        <w:t xml:space="preserve">FR-DA-GTE-02: </w:t>
-      </w:r>
-      <w:r>
-        <w:rPr>
-          <w:sz w:val="22"/>
-          <w:szCs w:val="22"/>
-          <w:lang w:val="en-US"/>
-        </w:rPr>
-        <w:t xml:space="preserve">The system shall let an authorized user attach one or more gates and one or more checklist templates to any phase of a project or a project template, reorder them, and detach them while the phase has not started.</w:t>
+        <w:t xml:space="preserve">FR-DA-GTE-01: </w:t>
+      </w:r>
+      <w:r>
+        <w:rPr>
+          <w:sz w:val="22"/>
+          <w:szCs w:val="22"/>
+          <w:lang w:val="en-US"/>
+        </w:rPr>
+        <w:t xml:space="preserve">The system shall keep a Gate Library with full Create, Read, Update, Delete and Duplicate on gate definitions, versioned: name, purpose, entry and exit criteria, approvers (roles or people), decision options Go, No-Go, Hold and Recycle, and applicability by vertical, mode and track.</w:t>
       </w:r>
     </w:p>
     <w:p>
@@ -18008,15 +18008,15 @@
           <w:szCs w:val="22"/>
           <w:lang w:val="en-US"/>
         </w:rPr>
-        <w:t xml:space="preserve">FR-DA-GTE-03: </w:t>
-      </w:r>
-      <w:r>
-        <w:rPr>
-          <w:sz w:val="22"/>
-          <w:szCs w:val="22"/>
-          <w:lang w:val="en-US"/>
-        </w:rPr>
-        <w:t xml:space="preserve">The system shall configure the gates of a project from its vertical and track: the number of gates depends on the track and the criteria on the vertical, and a gate may be marked optional for a track.</w:t>
+        <w:t xml:space="preserve">FR-DA-GTE-02: </w:t>
+      </w:r>
+      <w:r>
+        <w:rPr>
+          <w:sz w:val="22"/>
+          <w:szCs w:val="22"/>
+          <w:lang w:val="en-US"/>
+        </w:rPr>
+        <w:t xml:space="preserve">The system shall let an authorized user associate zero, one or several checklists of the Checklist Library with a gate, optionally per track, each marked mandatory or optional, in a chosen order; a checklist created from the gate screen shall be saved in the Checklist Library, and the same checklist may be associated with several gates.</w:t>
       </w:r>
     </w:p>
     <w:p>
@@ -18041,15 +18041,15 @@
           <w:szCs w:val="22"/>
           <w:lang w:val="en-US"/>
         </w:rPr>
-        <w:t xml:space="preserve">FR-DA-GTE-04: </w:t>
-      </w:r>
-      <w:r>
-        <w:rPr>
-          <w:sz w:val="22"/>
-          <w:szCs w:val="22"/>
-          <w:lang w:val="en-US"/>
-        </w:rPr>
-        <w:t xml:space="preserve">The system shall block the progression of a phase while a mandatory checklist item attached to its gate is incomplete; enforcement shall be configurable per gate and a waiver shall require justification and approval.</w:t>
+        <w:t xml:space="preserve">FR-DA-GTE-03: </w:t>
+      </w:r>
+      <w:r>
+        <w:rPr>
+          <w:sz w:val="22"/>
+          <w:szCs w:val="22"/>
+          <w:lang w:val="en-US"/>
+        </w:rPr>
+        <w:t xml:space="preserve">The system shall let an authorized user attach one or more gates to any phase of a project or a project template, reorder them, and detach them while the phase has not started; attaching a gate brings its associated checklists with it.</w:t>
       </w:r>
     </w:p>
     <w:p>
@@ -18074,15 +18074,15 @@
           <w:szCs w:val="22"/>
           <w:lang w:val="en-US"/>
         </w:rPr>
-        <w:t xml:space="preserve">FR-DA-GTE-05: </w:t>
-      </w:r>
-      <w:r>
-        <w:rPr>
-          <w:sz w:val="22"/>
-          <w:szCs w:val="22"/>
-          <w:lang w:val="en-US"/>
-        </w:rPr>
-        <w:t xml:space="preserve">The system shall capture every gate decision with its approvers, criteria results and comments, and keep an immutable audit trail of gate and checklist actions — creation, modification, attachment, completion, review, decision and waiver.</w:t>
+        <w:t xml:space="preserve">FR-DA-GTE-04: </w:t>
+      </w:r>
+      <w:r>
+        <w:rPr>
+          <w:sz w:val="22"/>
+          <w:szCs w:val="22"/>
+          <w:lang w:val="en-US"/>
+        </w:rPr>
+        <w:t xml:space="preserve">The system shall configure the gates of a project from its vertical and track: the number of gates depends on the track and the criteria on the vertical, and a gate may be marked optional for a track.</w:t>
       </w:r>
     </w:p>
     <w:p>
@@ -18107,6 +18107,39 @@
           <w:szCs w:val="22"/>
           <w:lang w:val="en-US"/>
         </w:rPr>
+        <w:t xml:space="preserve">FR-DA-GTE-05: </w:t>
+      </w:r>
+      <w:r>
+        <w:rPr>
+          <w:sz w:val="22"/>
+          <w:szCs w:val="22"/>
+          <w:lang w:val="en-US"/>
+        </w:rPr>
+        <w:t xml:space="preserve">The system shall block the progression of a phase while a mandatory item of a mandatory checklist associated with its gate is incomplete; enforcement shall be configurable per gate and a waiver shall require justification and approval.</w:t>
+      </w:r>
+    </w:p>
+    <w:p>
+      <w:pPr>
+        <w:pStyle w:val="Paragraphedeliste"/>
+        <w:numPr>
+          <w:ilvl w:val="0"/>
+          <w:numId w:val="2"/>
+        </w:numPr>
+        <w:spacing w:after="90" w:line="264" w:lineRule="auto"/>
+        <w:jc w:val="both"/>
+        <w:rPr>
+          <w:lang w:val="en-US"/>
+        </w:rPr>
+      </w:pPr>
+      <w:r>
+        <w:rPr>
+          <w:b/>
+          <w:bCs/>
+          <w:color w:val="3A3A3C"/>
+          <w:sz w:val="22"/>
+          <w:szCs w:val="22"/>
+          <w:lang w:val="en-US"/>
+        </w:rPr>
         <w:t xml:space="preserve">FR-DA-GTE-06: </w:t>
       </w:r>
       <w:r>
@@ -18115,7 +18148,40 @@
           <w:szCs w:val="22"/>
           <w:lang w:val="en-US"/>
         </w:rPr>
-        <w:t xml:space="preserve">Changing a gate or checklist in the library shall not alter the copies already attached to started phases; the user shall be offered to update not-yet-started phases to the new version.</w:t>
+        <w:t xml:space="preserve">The system shall capture every gate decision with its approvers, criteria results and comments, and keep an immutable audit trail of gate actions — creation, modification, checklist association, attachment to a phase, review, decision and waiver.</w:t>
+      </w:r>
+    </w:p>
+    <w:p>
+      <w:pPr>
+        <w:pStyle w:val="Paragraphedeliste"/>
+        <w:numPr>
+          <w:ilvl w:val="0"/>
+          <w:numId w:val="2"/>
+        </w:numPr>
+        <w:spacing w:after="90" w:line="264" w:lineRule="auto"/>
+        <w:jc w:val="both"/>
+        <w:rPr>
+          <w:lang w:val="en-US"/>
+        </w:rPr>
+      </w:pPr>
+      <w:r>
+        <w:rPr>
+          <w:b/>
+          <w:bCs/>
+          <w:color w:val="3A3A3C"/>
+          <w:sz w:val="22"/>
+          <w:szCs w:val="22"/>
+          <w:lang w:val="en-US"/>
+        </w:rPr>
+        <w:t xml:space="preserve">FR-DA-GTE-07: </w:t>
+      </w:r>
+      <w:r>
+        <w:rPr>
+          <w:sz w:val="22"/>
+          <w:szCs w:val="22"/>
+          <w:lang w:val="en-US"/>
+        </w:rPr>
+        <w:t xml:space="preserve">Changing a gate, or a checklist associated with it, shall not alter the copies already attached to started phases; the user shall be offered to update not-yet-started phases to the new version.</w:t>
       </w:r>
     </w:p>
     <w:p>
@@ -22673,7 +22739,7 @@
                 <w:szCs w:val="19"/>
                 <w:lang w:val="en-US"/>
               </w:rPr>
-              <w:t xml:space="preserve">A versioned list of checklist items for one stage and variant, linked or not to its stage.</w:t>
+              <w:t xml:space="preserve">A versioned list of checklist items in the Checklist Library, universal or specific to a vertical, mode or track, associated with zero or more gates (GateChecklist).</w:t>
             </w:r>
           </w:p>
         </w:tc>
@@ -23137,7 +23203,7 @@
                 <w:szCs w:val="19"/>
                 <w:lang w:val="en-US"/>
               </w:rPr>
-              <w:t xml:space="preserve">A library gate: criteria, approvers, decision options, applicability, version.</w:t>
+              <w:t xml:space="preserve">A Gate Library entry: criteria, approvers, decision options, applicability, version.</w:t>
             </w:r>
           </w:p>
         </w:tc>
@@ -23167,7 +23233,7 @@
                 <w:sz w:val="19"/>
                 <w:szCs w:val="19"/>
               </w:rPr>
-              <w:t xml:space="preserve">PhaseAttachment</w:t>
+              <w:t xml:space="preserve">GateChecklist</w:t>
             </w:r>
           </w:p>
         </w:tc>
@@ -23195,7 +23261,7 @@
                 <w:szCs w:val="19"/>
                 <w:lang w:val="en-US"/>
               </w:rPr>
-              <w:t xml:space="preserve">The attachment of a gate or a checklist template, at a given version, to a phase of a project or a template.</w:t>
+              <w:t xml:space="preserve">The association of a checklist template with a gate, optionally per track, with its order and whether it is mandatory.</w:t>
             </w:r>
           </w:p>
         </w:tc>
@@ -23225,7 +23291,7 @@
                 <w:sz w:val="19"/>
                 <w:szCs w:val="19"/>
               </w:rPr>
-              <w:t xml:space="preserve">Pack</w:t>
+              <w:t xml:space="preserve">PhaseAttachment</w:t>
             </w:r>
           </w:p>
         </w:tc>
@@ -23253,7 +23319,7 @@
                 <w:szCs w:val="19"/>
                 <w:lang w:val="en-US"/>
               </w:rPr>
-              <w:t xml:space="preserve">An SME pack, vertical pack or bundle: contents, target segment, pricing rules.</w:t>
+              <w:t xml:space="preserve">The attachment of a gate, or of a checklist not related to a gate, at a given version, to a phase of a project or a template.</w:t>
             </w:r>
           </w:p>
         </w:tc>
@@ -23283,6 +23349,64 @@
                 <w:sz w:val="19"/>
                 <w:szCs w:val="19"/>
               </w:rPr>
+              <w:t xml:space="preserve">Pack</w:t>
+            </w:r>
+          </w:p>
+        </w:tc>
+        <w:tc>
+          <w:tcPr>
+            <w:tcW w:w="6700" w:type="dxa"/>
+            <w:shd w:val="clear" w:color="auto" w:fill="FFFFFF"/>
+            <w:tcMar>
+              <w:top w:w="80" w:type="dxa"/>
+              <w:left w:w="100" w:type="dxa"/>
+              <w:bottom w:w="80" w:type="dxa"/>
+              <w:right w:w="100" w:type="dxa"/>
+            </w:tcMar>
+            <w:vAlign w:val="center"/>
+          </w:tcPr>
+          <w:p>
+            <w:pPr>
+              <w:rPr>
+                <w:lang w:val="en-US"/>
+              </w:rPr>
+            </w:pPr>
+            <w:r>
+              <w:rPr>
+                <w:sz w:val="19"/>
+                <w:szCs w:val="19"/>
+                <w:lang w:val="en-US"/>
+              </w:rPr>
+              <w:t xml:space="preserve">An SME pack, vertical pack or bundle: contents, target segment, pricing rules.</w:t>
+            </w:r>
+          </w:p>
+        </w:tc>
+      </w:tr>
+      <w:tr>
+        <w:tblPrEx>
+          <w:tblCellMar>
+            <w:top w:w="0" w:type="dxa"/>
+            <w:bottom w:w="0" w:type="dxa"/>
+          </w:tblCellMar>
+        </w:tblPrEx>
+        <w:tc>
+          <w:tcPr>
+            <w:tcW w:w="3200" w:type="dxa"/>
+            <w:shd w:val="clear" w:color="auto" w:fill="FFFFFF"/>
+            <w:tcMar>
+              <w:top w:w="80" w:type="dxa"/>
+              <w:left w:w="100" w:type="dxa"/>
+              <w:bottom w:w="80" w:type="dxa"/>
+              <w:right w:w="100" w:type="dxa"/>
+            </w:tcMar>
+            <w:vAlign w:val="center"/>
+          </w:tcPr>
+          <w:p>
+            <w:r>
+              <w:rPr>
+                <w:sz w:val="19"/>
+                <w:szCs w:val="19"/>
+              </w:rPr>
               <w:t xml:space="preserve">OnboardingPlan</w:t>
             </w:r>
           </w:p>
@@ -23413,7 +23537,7 @@
         <w:rPr>
           <w:lang w:val="en-US"/>
         </w:rPr>
-        <w:t xml:space="preserve">Revision 1.3 adds screens for verticals and their activation, SME tracks and complexity criteria, packs, the project template catalog, a project creation entry with three tabs (From the catalog, Manual, With AI), and the gate and checklist library with attachment to phases.</w:t>
+        <w:t xml:space="preserve">Revision 1.3 adds screens for verticals and their activation, SME tracks and complexity criteria, packs, the project template catalog, a project creation entry with three tabs (From the catalog, Manual, With AI), a Checklist Library (checklists related to a gate or not) and a Gate Library (gates with their associated checklists), both attachable to phases.</w:t>
       </w:r>
     </w:p>
     <w:p>
@@ -23828,7 +23952,7 @@
           <w:szCs w:val="22"/>
           <w:lang w:val="en-US"/>
         </w:rPr>
-        <w:t xml:space="preserve">Checklist templates: library CRUD with version history; add to a stage checklist from a template or by hand; save a stage checklist as a template.</w:t>
+        <w:t xml:space="preserve">Checklist templates: library CRUD with version history; add to a gate or phase checklist from a template or by hand; save it as a template.</w:t>
       </w:r>
     </w:p>
     <w:p>
@@ -23982,7 +24106,29 @@
           <w:szCs w:val="22"/>
           <w:lang w:val="en-US"/>
         </w:rPr>
-        <w:t xml:space="preserve">Gates and checklists: gate library CRUD and versions; attach, reorder and detach gates and checklists on a phase; decisions and waivers.</w:t>
+        <w:t xml:space="preserve">Checklist Library: CRUD, duplicate and versions; filter by gate or "not related to a gate"; gates using a checklist; attach a stand-alone checklist to a phase, task or project.</w:t>
+      </w:r>
+    </w:p>
+    <w:p>
+      <w:pPr>
+        <w:pStyle w:val="Paragraphedeliste"/>
+        <w:numPr>
+          <w:ilvl w:val="0"/>
+          <w:numId w:val="2"/>
+        </w:numPr>
+        <w:spacing w:after="90" w:line="264" w:lineRule="auto"/>
+        <w:jc w:val="both"/>
+        <w:rPr>
+          <w:lang w:val="en-US"/>
+        </w:rPr>
+      </w:pPr>
+      <w:r>
+        <w:rPr>
+          <w:sz w:val="22"/>
+          <w:szCs w:val="22"/>
+          <w:lang w:val="en-US"/>
+        </w:rPr>
+        <w:t xml:space="preserve">Gate Library: CRUD, duplicate and versions; associate, order and detach checklists; attach, reorder and detach gates on a phase; decisions and waivers.</w:t>
       </w:r>
     </w:p>
     <w:p>
@@ -26415,7 +26561,7 @@
                 <w:sz w:val="19"/>
                 <w:szCs w:val="19"/>
               </w:rPr>
-              <w:t xml:space="preserve">Gate &amp; Checklist Library (Section 4.35, FR-DA-CHK-06)</w:t>
+              <w:t xml:space="preserve">Checklist Library and Gate Library (Sections 4.23 and 4.35)</w:t>
             </w:r>
           </w:p>
         </w:tc>
@@ -26443,7 +26589,7 @@
                 <w:szCs w:val="19"/>
                 <w:lang w:val="en-US"/>
               </w:rPr>
-              <w:t xml:space="preserve">Gates as library entries with CRUD, attachable with checklists to any phase.</w:t>
+              <w:t xml:space="preserve">Checklists as independent entries, related to a gate or not; gates as library entries with CRUD and associated checklists; both attachable to any phase.</w:t>
             </w:r>
           </w:p>
         </w:tc>
@@ -26471,7 +26617,7 @@
                 <w:szCs w:val="19"/>
                 <w:lang w:val="en-US"/>
               </w:rPr>
-              <w:t xml:space="preserve">New in revision 1.3. CortexPLM has the checklist template library per gate and track (FR-DA-CHK-01 – 05); its gates are fixed per track in code, so gate CRUD and attachment to any phase are a target.</w:t>
+              <w:t xml:space="preserve">Reworded or new in revision 1.3. CortexPLM keeps checklist templates per gate and track, copied when the gate opens, and adds items from a template or by hand; stand-alone checklists, gate CRUD, gate-checklist association and attachment to any phase are a target, because its gates are fixed per track in code.</w:t>
             </w:r>
           </w:p>
         </w:tc>
@@ -30577,7 +30723,7 @@
         <w:rPr>
           <w:lang w:val="en-US"/>
         </w:rPr>
-        <w:t xml:space="preserve">Revision 1.3 is additive, like 1.1 and 1.2: every earlier requirement keeps its ID and wording, and new requirements take the next free number in their section or a new family.</w:t>
+        <w:t xml:space="preserve">Revision 1.3 keeps every earlier requirement ID. It is additive except in Section 4.23, where five requirements are reworded so that checklists and gates are separate libraries; new requirements take the next free number in their section or a new family.</w:t>
       </w:r>
     </w:p>
     <w:tbl>
@@ -30833,7 +30979,7 @@
                 <w:szCs w:val="19"/>
                 <w:lang w:val="en-US"/>
               </w:rPr>
-              <w:t xml:space="preserve">11 terms added</w:t>
+              <w:t xml:space="preserve">11 terms added, 1 reworded</w:t>
             </w:r>
           </w:p>
         </w:tc>
@@ -30861,7 +31007,7 @@
                 <w:szCs w:val="19"/>
                 <w:lang w:val="en-US"/>
               </w:rPr>
-              <w:t xml:space="preserve">Vertical, Vertical Instance, SME, Mode (Full / SME), SME Track, Complexity Score, Project Template Catalog, Creation Mode, Phase, Gate Definition, Pack / Bundle.</w:t>
+              <w:t xml:space="preserve">Stage Checklist Template renamed Checklist Template. Added: Vertical, Vertical Instance, SME, Mode (Full / SME), SME Track, Complexity Score, Project Template Catalog, Creation Mode, Phase, Gate Definition, Pack / Bundle.</w:t>
             </w:r>
           </w:p>
         </w:tc>
@@ -31161,7 +31307,7 @@
                 <w:sz w:val="19"/>
                 <w:szCs w:val="19"/>
               </w:rPr>
-              <w:t xml:space="preserve">4.23 Stage Checklist Library</w:t>
+              <w:t xml:space="preserve">4.23 Checklist Library (renamed)</w:t>
             </w:r>
           </w:p>
         </w:tc>
@@ -31189,7 +31335,7 @@
                 <w:szCs w:val="19"/>
                 <w:lang w:val="en-US"/>
               </w:rPr>
-              <w:t xml:space="preserve">FR-DA-CHK-06</w:t>
+              <w:t xml:space="preserve">FR-DA-CHK-01 – 05 reworded; CHK-06 – 07 (new)</w:t>
             </w:r>
           </w:p>
         </w:tc>
@@ -31217,7 +31363,7 @@
                 <w:szCs w:val="19"/>
                 <w:lang w:val="en-US"/>
               </w:rPr>
-              <w:t xml:space="preserve">Checklist templates attachable to any phase of a project or template.</w:t>
+              <w:t xml:space="preserve">Renamed from Stage Checklist Library. A checklist is an independent library entry, related to zero, one or several gates; stand-alone checklists attach to a phase, task or project without blocking progression; impact shown before change or deletion.</w:t>
             </w:r>
           </w:p>
         </w:tc>
@@ -32143,7 +32289,7 @@
                 <w:szCs w:val="19"/>
                 <w:lang w:val="en-US"/>
               </w:rPr>
-              <w:t xml:space="preserve">4.35 Gate &amp; Checklist Library</w:t>
+              <w:t xml:space="preserve">4.35 Gate Library</w:t>
             </w:r>
           </w:p>
         </w:tc>
@@ -32171,7 +32317,7 @@
                 <w:szCs w:val="19"/>
                 <w:lang w:val="en-US"/>
               </w:rPr>
-              <w:t xml:space="preserve">FR-DA-GTE-01 – 06 (new)</w:t>
+              <w:t xml:space="preserve">FR-DA-GTE-01 – 07 (new)</w:t>
             </w:r>
           </w:p>
         </w:tc>
@@ -32199,7 +32345,7 @@
                 <w:szCs w:val="19"/>
                 <w:lang w:val="en-US"/>
               </w:rPr>
-              <w:t xml:space="preserve">Gate definitions with CRUD and versions; attachment of gates and checklists to any phase; vertical- and track-aware gates; enforcement and waivers; decisions and audit; library changes never alter started phases.</w:t>
+              <w:t xml:space="preserve">Gate definitions with CRUD and versions; association of checklists from the Checklist Library; attachment of gates to any phase; vertical- and track-aware gates; enforcement and waivers; decisions and audit; library changes never alter started phases.</w:t>
             </w:r>
           </w:p>
         </w:tc>
@@ -32435,7 +32581,7 @@
                 <w:szCs w:val="19"/>
                 <w:lang w:val="en-US"/>
               </w:rPr>
-              <w:t xml:space="preserve">10 entities</w:t>
+              <w:t xml:space="preserve">11 entities, 1 reworded</w:t>
             </w:r>
           </w:p>
         </w:tc>
@@ -32463,7 +32609,7 @@
                 <w:szCs w:val="19"/>
                 <w:lang w:val="en-US"/>
               </w:rPr>
-              <w:t xml:space="preserve">Vertical, VerticalActivation, SmeTrack, ComplexityCriterion, ComplexityScore, ProjectTemplate, GateDefinition, PhaseAttachment, Pack, OnboardingPlan.</w:t>
+              <w:t xml:space="preserve">Vertical, VerticalActivation, SmeTrack, ComplexityCriterion, ComplexityScore, ProjectTemplate, GateDefinition, GateChecklist, PhaseAttachment, Pack, OnboardingPlan; ChecklistTemplate no longer tied to one stage.</w:t>
             </w:r>
           </w:p>
         </w:tc>
@@ -34542,7 +34688,7 @@
                 <w:szCs w:val="19"/>
                 <w:lang w:val="en-US"/>
               </w:rPr>
-              <w:t xml:space="preserve">FR-DA-CHK-01 – 06, FR-DA-GTE-04, 05</w:t>
+              <w:t xml:space="preserve">FR-DA-CHK-01 – 07, FR-DA-GTE-05, 06</w:t>
             </w:r>
           </w:p>
         </w:tc>
@@ -34628,7 +34774,7 @@
                 <w:szCs w:val="19"/>
                 <w:lang w:val="en-US"/>
               </w:rPr>
-              <w:t xml:space="preserve">FR-DA-GTE-01, 03, 05</w:t>
+              <w:t xml:space="preserve">FR-DA-GTE-01, 02, 04, 06</w:t>
             </w:r>
           </w:p>
         </w:tc>

</xml_diff>